<commit_message>
- Added new examples for BLE.
</commit_message>
<xml_diff>
--- a/Documentation/BLE_Help_and_Info.docx
+++ b/Documentation/BLE_Help_and_Info.docx
@@ -404,14 +404,8 @@
     <w:p>
       <w:pPr>
         <w:pStyle w:val="Heading4"/>
-        <w:rPr>
-          <w:color w:val="0D0D0D" w:themeColor="text1" w:themeTint="F2"/>
-        </w:rPr>
-      </w:pPr>
-      <w:r>
-        <w:rPr>
-          <w:color w:val="0D0D0D" w:themeColor="text1" w:themeTint="F2"/>
-        </w:rPr>
+      </w:pPr>
+      <w:r>
         <w:t>The data length and MTU (Maximum Transfer Unit) are two different parameters, but they often go hand in hand.</w:t>
       </w:r>
     </w:p>
@@ -431,9 +425,6 @@
         </w:rPr>
       </w:pPr>
       <w:r>
-        <w:rPr>
-          <w:color w:val="0D0D0D" w:themeColor="text1" w:themeTint="F2"/>
-        </w:rPr>
         <w:t>The MTU is the number of bytes that can be sent in one GATT operation (for example, a send operation), while data length is the number of bytes that can be sent in one Bluetooth LE packet. MTU has a default value of 23 bytes, and data length has a default value of 27 bytes. When MTU is larger than data length, such as MTU being 140 bytes while data length</w:t>
       </w:r>
       <w:r>
@@ -577,28 +568,16 @@
     <w:p>
       <w:pPr>
         <w:pStyle w:val="Heading4"/>
-        <w:rPr>
-          <w:color w:val="0D0D0D" w:themeColor="text1" w:themeTint="F2"/>
-        </w:rPr>
-      </w:pPr>
-      <w:r>
-        <w:rPr>
-          <w:color w:val="0D0D0D" w:themeColor="text1" w:themeTint="F2"/>
-        </w:rPr>
+      </w:pPr>
+      <w:r>
         <w:t>The connection interval, supervision timeout and peripheral latency are dictated by the central, but the peripheral can request changes. However, it is always the central that has the final say with these requests.</w:t>
       </w:r>
     </w:p>
     <w:p>
       <w:pPr>
         <w:pStyle w:val="Heading4"/>
-        <w:rPr>
-          <w:color w:val="0D0D0D" w:themeColor="text1" w:themeTint="F2"/>
-        </w:rPr>
-      </w:pPr>
-      <w:r>
-        <w:rPr>
-          <w:color w:val="0D0D0D" w:themeColor="text1" w:themeTint="F2"/>
-        </w:rPr>
+      </w:pPr>
+      <w:r>
         <w:t>The default value for the PHY radio mode is 1M, and the default MTU is 23.</w:t>
       </w:r>
     </w:p>
@@ -627,28 +606,16 @@
     <w:p>
       <w:pPr>
         <w:pStyle w:val="Heading4"/>
-        <w:rPr>
-          <w:color w:val="0D0D0D" w:themeColor="text1" w:themeTint="F2"/>
-        </w:rPr>
-      </w:pPr>
-      <w:r>
-        <w:rPr>
-          <w:color w:val="0D0D0D" w:themeColor="text1" w:themeTint="F2"/>
-        </w:rPr>
+      </w:pPr>
+      <w:r>
         <w:t xml:space="preserve">As we’ve seen, the GATT layer defines services and characteristics, made up of </w:t>
       </w:r>
       <w:proofErr w:type="gramStart"/>
       <w:r>
-        <w:rPr>
-          <w:color w:val="0D0D0D" w:themeColor="text1" w:themeTint="F2"/>
-        </w:rPr>
         <w:t>attributes, that</w:t>
       </w:r>
       <w:proofErr w:type="gramEnd"/>
       <w:r>
-        <w:rPr>
-          <w:color w:val="0D0D0D" w:themeColor="text1" w:themeTint="F2"/>
-        </w:rPr>
         <w:t xml:space="preserve"> are stored in the GATT server.</w:t>
       </w:r>
     </w:p>
@@ -656,13 +623,11 @@
       <w:pPr>
         <w:pStyle w:val="Heading4"/>
         <w:rPr>
-          <w:color w:val="0D0D0D" w:themeColor="text1" w:themeTint="F2"/>
           <w:shd w:val="clear" w:color="auto" w:fill="FFFFFF"/>
         </w:rPr>
       </w:pPr>
       <w:r>
         <w:rPr>
-          <w:color w:val="0D0D0D" w:themeColor="text1" w:themeTint="F2"/>
           <w:shd w:val="clear" w:color="auto" w:fill="FFFFFF"/>
         </w:rPr>
         <w:t>The server can either send data directly to the client or the client can poll the data from the server. But for the client to know what to request from the server, it needs to know what services and characteristics the GATT server offers. The client will therefore perform service discovery at the beginning of the connection, to learn about the services and characteristics of the server, before performing any operations to access them.</w:t>
@@ -718,7 +683,6 @@
       <w:r>
         <w:rPr>
           <w:rStyle w:val="Heading4Char"/>
-          <w:color w:val="0D0D0D" w:themeColor="text1" w:themeTint="F2"/>
         </w:rPr>
         <w:t>The process in which a GATT client discovers the services and characteristics in an attribute table hosted by a GATT server</w:t>
       </w:r>
@@ -766,14 +730,8 @@
     <w:p>
       <w:pPr>
         <w:pStyle w:val="Heading4"/>
-        <w:rPr>
-          <w:color w:val="0D0D0D" w:themeColor="text1" w:themeTint="F2"/>
-        </w:rPr>
-      </w:pPr>
-      <w:r>
-        <w:rPr>
-          <w:color w:val="0D0D0D" w:themeColor="text1" w:themeTint="F2"/>
-        </w:rPr>
+      </w:pPr>
+      <w:r>
         <w:t>Client-initiated operations are GATT operations where the client requests data from the GATT server. The client can request to either read or write to an attribute, and in the case of the latter, it can choose whether to receive an acknowledgment from the server.</w:t>
       </w:r>
     </w:p>
@@ -788,14 +746,8 @@
     <w:p>
       <w:pPr>
         <w:pStyle w:val="Heading4"/>
-        <w:rPr>
-          <w:color w:val="0D0D0D" w:themeColor="text1" w:themeTint="F2"/>
-        </w:rPr>
-      </w:pPr>
-      <w:r>
-        <w:rPr>
-          <w:color w:val="0D0D0D" w:themeColor="text1" w:themeTint="F2"/>
-        </w:rPr>
+      </w:pPr>
+      <w:r>
         <w:t>If a client wishes to read a certain value stored in an attribute on a GATT server, the client sends a read request to the server. To which the server responds by returning the attribute value.</w:t>
       </w:r>
     </w:p>
@@ -811,14 +763,8 @@
     <w:p>
       <w:pPr>
         <w:pStyle w:val="Heading4"/>
-        <w:rPr>
-          <w:color w:val="0D0D0D" w:themeColor="text1" w:themeTint="F2"/>
-        </w:rPr>
-      </w:pPr>
-      <w:r>
-        <w:rPr>
-          <w:color w:val="0D0D0D" w:themeColor="text1" w:themeTint="F2"/>
-        </w:rPr>
+      </w:pPr>
+      <w:r>
         <w:t>If the client wishes to write a certain value to an attribute, it sends a write request</w:t>
       </w:r>
       <w:r>
@@ -840,9 +786,6 @@
         <w:t> </w:t>
       </w:r>
       <w:r>
-        <w:rPr>
-          <w:color w:val="0D0D0D" w:themeColor="text1" w:themeTint="F2"/>
-        </w:rPr>
         <w:t>and provides data that matches the same format of the target attribute. If the server accepts the write operation, it responds with an acknowledgement.</w:t>
       </w:r>
     </w:p>
@@ -857,14 +800,8 @@
     <w:p>
       <w:pPr>
         <w:pStyle w:val="Heading4"/>
-        <w:rPr>
-          <w:color w:val="0D0D0D" w:themeColor="text1" w:themeTint="F2"/>
-        </w:rPr>
-      </w:pPr>
-      <w:r>
-        <w:rPr>
-          <w:color w:val="0D0D0D" w:themeColor="text1" w:themeTint="F2"/>
-        </w:rPr>
+      </w:pPr>
+      <w:r>
         <w:t>If this operation is enabled, a client can write data to an attribute without waiting for an acknowledgment from the server. </w:t>
       </w:r>
     </w:p>
@@ -879,14 +816,8 @@
     <w:p>
       <w:pPr>
         <w:pStyle w:val="Heading4"/>
-        <w:rPr>
-          <w:color w:val="0D0D0D" w:themeColor="text1" w:themeTint="F2"/>
-        </w:rPr>
-      </w:pPr>
-      <w:r>
-        <w:rPr>
-          <w:color w:val="0D0D0D" w:themeColor="text1" w:themeTint="F2"/>
-        </w:rPr>
+      </w:pPr>
+      <w:r>
         <w:t>The other category of GATT operations are server-initiated operations, where the server sends information directly to the client, without receiving a request first. In this case, the server can either notify or indicate.</w:t>
       </w:r>
     </w:p>
@@ -901,28 +832,16 @@
     <w:p>
       <w:pPr>
         <w:pStyle w:val="Heading4"/>
-        <w:rPr>
-          <w:color w:val="0D0D0D" w:themeColor="text1" w:themeTint="F2"/>
-        </w:rPr>
-      </w:pPr>
-      <w:r>
-        <w:rPr>
-          <w:color w:val="0D0D0D" w:themeColor="text1" w:themeTint="F2"/>
-        </w:rPr>
+      </w:pPr>
+      <w:r>
         <w:t>A Notify operation is used by the server to automatically push the value of a certain attribute to the client, without the client asking for it. This, for example, can be used to update the client about a certain sensor reading which has changed recently.</w:t>
       </w:r>
     </w:p>
     <w:p>
       <w:pPr>
         <w:pStyle w:val="Heading4"/>
-        <w:rPr>
-          <w:color w:val="0D0D0D" w:themeColor="text1" w:themeTint="F2"/>
-        </w:rPr>
-      </w:pPr>
-      <w:r>
-        <w:rPr>
-          <w:color w:val="0D0D0D" w:themeColor="text1" w:themeTint="F2"/>
-        </w:rPr>
+      </w:pPr>
+      <w:r>
         <w:t>Notifications require no acknowledgment back from the client.</w:t>
       </w:r>
     </w:p>
@@ -937,28 +856,16 @@
     <w:p>
       <w:pPr>
         <w:pStyle w:val="Heading4"/>
-        <w:rPr>
-          <w:color w:val="0D0D0D" w:themeColor="text1" w:themeTint="F2"/>
-        </w:rPr>
-      </w:pPr>
-      <w:r>
-        <w:rPr>
-          <w:color w:val="0D0D0D" w:themeColor="text1" w:themeTint="F2"/>
-        </w:rPr>
+      </w:pPr>
+      <w:r>
         <w:t>Similar to the Notify operation, Indicate will also push the attribute value directly to the client. However, in this case, an acknowledgment from the client is required. Because of the acknowledgement requirement, you can only send one Indication per connection interval, meaning Indications are slower than notifications.</w:t>
       </w:r>
     </w:p>
     <w:p>
       <w:pPr>
         <w:pStyle w:val="Heading4"/>
-        <w:rPr>
-          <w:color w:val="0D0D0D" w:themeColor="text1" w:themeTint="F2"/>
-        </w:rPr>
-      </w:pPr>
-      <w:r>
-        <w:rPr>
-          <w:color w:val="0D0D0D" w:themeColor="text1" w:themeTint="F2"/>
-        </w:rPr>
+      </w:pPr>
+      <w:r>
         <w:t>Although these operations are initiated by the server, the client is required to enable them first by subscribing to the characteristic and enabling either notifications or indications.</w:t>
       </w:r>
     </w:p>
@@ -973,14 +880,8 @@
     <w:p>
       <w:pPr>
         <w:pStyle w:val="Heading4"/>
-        <w:rPr>
-          <w:color w:val="0D0D0D" w:themeColor="text1" w:themeTint="F2"/>
-        </w:rPr>
-      </w:pPr>
-      <w:r>
-        <w:rPr>
-          <w:color w:val="0D0D0D" w:themeColor="text1" w:themeTint="F2"/>
-        </w:rPr>
+      </w:pPr>
+      <w:r>
         <w:t>As discussed in previous topics, the ATT layer defines attributes and how data is exposed between a client and a server. As such, one of the main functions of GATT is the hierarchal structuring of attributes stored in a GATT server into standardized entities (services and characteristics) providing seamless interoperability between different Bluetooth LE devices.</w:t>
       </w:r>
     </w:p>
@@ -996,14 +897,8 @@
     <w:p>
       <w:pPr>
         <w:pStyle w:val="Heading4"/>
-        <w:rPr>
-          <w:color w:val="0D0D0D" w:themeColor="text1" w:themeTint="F2"/>
-        </w:rPr>
-      </w:pPr>
-      <w:r>
-        <w:rPr>
-          <w:color w:val="0D0D0D" w:themeColor="text1" w:themeTint="F2"/>
-        </w:rPr>
+      </w:pPr>
+      <w:r>
         <w:t>The ATT layer defines how data is stored and accessed in a server’s database. The data is stored in the form of data structures called Attributes. Attributes are the core data units that both the ATT and GATT layers are based on. Attributes hold user data as well as metadata describing the attribute itself, its type, security permissions, etc. Data exchange occurring between ATT servers and clients, or, GATT servers and clients, is in the form of attributes. When discussing only attributes, they are said to be stored in an ATT server.</w:t>
       </w:r>
     </w:p>
@@ -1036,6 +931,7 @@
       </w:pPr>
       <w:r>
         <w:rPr>
+          <w:noProof/>
           <w:lang w:eastAsia="en-IN"/>
         </w:rPr>
         <w:drawing>
@@ -1088,13 +984,11 @@
         <w:rPr>
           <w:rStyle w:val="Heading4Char"/>
           <w:rFonts w:eastAsiaTheme="minorHAnsi"/>
-          <w:color w:val="0D0D0D" w:themeColor="text1" w:themeTint="F2"/>
         </w:rPr>
       </w:pPr>
       <w:r>
         <w:rPr>
           <w:rStyle w:val="Heading5Char"/>
-          <w:color w:val="0D0D0D" w:themeColor="text1" w:themeTint="F2"/>
         </w:rPr>
         <w:t>Handle</w:t>
       </w:r>
@@ -1112,7 +1006,6 @@
         <w:rPr>
           <w:rStyle w:val="Heading4Char"/>
           <w:rFonts w:eastAsiaTheme="minorHAnsi"/>
-          <w:color w:val="0D0D0D" w:themeColor="text1" w:themeTint="F2"/>
         </w:rPr>
         <w:t>A 16-bit unique index to a specific attribute in the attribute table, assigned by the stack. An attribute is addressed via its handle. You can think of it as the row number in the attribute table, although handles are not necessarily sequential.</w:t>
       </w:r>
@@ -1138,7 +1031,6 @@
       <w:r>
         <w:rPr>
           <w:rStyle w:val="Heading5Char"/>
-          <w:color w:val="0D0D0D" w:themeColor="text1" w:themeTint="F2"/>
         </w:rPr>
         <w:t>Type (UUID):</w:t>
       </w:r>
@@ -1156,7 +1048,6 @@
         <w:rPr>
           <w:rStyle w:val="Heading4Char"/>
           <w:rFonts w:eastAsiaTheme="minorHAnsi"/>
-          <w:color w:val="0D0D0D" w:themeColor="text1" w:themeTint="F2"/>
         </w:rPr>
         <w:t>Universally unique ID (UUID), which tells us the attribute type. For example, if this attribute declares a characteristic, this will be reflected in its Type field as it will hold a UUID used specifically to indicate declaring a characteristic.</w:t>
       </w:r>
@@ -1174,13 +1065,11 @@
         <w:rPr>
           <w:rStyle w:val="Heading4Char"/>
           <w:rFonts w:eastAsiaTheme="minorHAnsi"/>
-          <w:color w:val="0D0D0D" w:themeColor="text1" w:themeTint="F2"/>
         </w:rPr>
       </w:pPr>
       <w:r>
         <w:rPr>
           <w:rStyle w:val="Heading5Char"/>
-          <w:color w:val="0D0D0D" w:themeColor="text1" w:themeTint="F2"/>
         </w:rPr>
         <w:t>Permissions:</w:t>
       </w:r>
@@ -1198,7 +1087,6 @@
         <w:rPr>
           <w:rStyle w:val="Heading4Char"/>
           <w:rFonts w:eastAsiaTheme="minorHAnsi"/>
-          <w:color w:val="0D0D0D" w:themeColor="text1" w:themeTint="F2"/>
         </w:rPr>
         <w:t>The security level required (encryption and/or authorization) to handle that attribute, in addition to indicating whether it’s a readable and/or writeable attribute.</w:t>
       </w:r>
@@ -1206,28 +1094,16 @@
     <w:p>
       <w:pPr>
         <w:pStyle w:val="Heading5"/>
-        <w:rPr>
-          <w:color w:val="0D0D0D" w:themeColor="text1" w:themeTint="F2"/>
-        </w:rPr>
-      </w:pPr>
-      <w:r>
-        <w:rPr>
-          <w:color w:val="0D0D0D" w:themeColor="text1" w:themeTint="F2"/>
-        </w:rPr>
+      </w:pPr>
+      <w:r>
         <w:t>Value:</w:t>
       </w:r>
     </w:p>
     <w:p>
       <w:pPr>
         <w:pStyle w:val="Heading4"/>
-        <w:rPr>
-          <w:color w:val="0D0D0D" w:themeColor="text1" w:themeTint="F2"/>
-        </w:rPr>
-      </w:pPr>
-      <w:r>
-        <w:rPr>
-          <w:color w:val="0D0D0D" w:themeColor="text1" w:themeTint="F2"/>
-        </w:rPr>
+      </w:pPr>
+      <w:r>
         <w:lastRenderedPageBreak/>
         <w:t>The actual user data (ex: sensor reading) that is stored in the attribute. This field accepts any data type. It can hold a heart rate monitor value (beats per minute), a temperature reading, or even a string.</w:t>
       </w:r>
@@ -1235,20 +1111,11 @@
     <w:p>
       <w:pPr>
         <w:pStyle w:val="Heading4"/>
-        <w:rPr>
-          <w:color w:val="0D0D0D" w:themeColor="text1" w:themeTint="F2"/>
-        </w:rPr>
-      </w:pPr>
-      <w:r>
-        <w:rPr>
-          <w:color w:val="0D0D0D" w:themeColor="text1" w:themeTint="F2"/>
-        </w:rPr>
+      </w:pPr>
+      <w:r>
         <w:t>It can also hold information (me</w:t>
       </w:r>
       <w:r>
-        <w:rPr>
-          <w:color w:val="0D0D0D" w:themeColor="text1" w:themeTint="F2"/>
-        </w:rPr>
         <w:t>tadata) about another attribute.</w:t>
       </w:r>
     </w:p>
@@ -1263,42 +1130,24 @@
     <w:p>
       <w:pPr>
         <w:pStyle w:val="Heading4"/>
-        <w:rPr>
-          <w:color w:val="0D0D0D" w:themeColor="text1" w:themeTint="F2"/>
-        </w:rPr>
-      </w:pPr>
-      <w:r>
-        <w:rPr>
-          <w:color w:val="0D0D0D" w:themeColor="text1" w:themeTint="F2"/>
-        </w:rPr>
+      </w:pPr>
+      <w:r>
         <w:t>UUIDs have two types.</w:t>
       </w:r>
     </w:p>
     <w:p>
       <w:pPr>
         <w:pStyle w:val="Heading4"/>
-        <w:rPr>
-          <w:color w:val="0D0D0D" w:themeColor="text1" w:themeTint="F2"/>
-        </w:rPr>
-      </w:pPr>
-      <w:r>
-        <w:rPr>
-          <w:color w:val="0D0D0D" w:themeColor="text1" w:themeTint="F2"/>
-        </w:rPr>
+      </w:pPr>
+      <w:r>
         <w:t>The first type is the SIG-defined 16-bit UUID. For example, the SIG-defined Heart rate service has the UUID 0x180D and one of its enclosed characteristics, the Heart Rate Measurement characteristic, has the UUID 0x2A37. The 16-bit UUID is energy and memory efficient, but since it only provides a relatively limited number of unique IDs, there is a need for more UUID to cover all vendors, users, and use cases.</w:t>
       </w:r>
     </w:p>
     <w:p>
       <w:pPr>
         <w:pStyle w:val="Heading4"/>
-        <w:rPr>
-          <w:color w:val="0D0D0D" w:themeColor="text1" w:themeTint="F2"/>
-        </w:rPr>
-      </w:pPr>
-      <w:r>
-        <w:rPr>
-          <w:color w:val="0D0D0D" w:themeColor="text1" w:themeTint="F2"/>
-        </w:rPr>
+      </w:pPr>
+      <w:r>
         <w:t>The second type is a 128-bit UUID, sometimes referred to as a vendor-specific UUID. This is the type of UUID you need to use when you are making your own custom services and characteristics. It looks something like this: 4A98-xxxx-1CC4-E7C1-C757-F1267DD021E8 and is called the “base UUID”. The four x’s represent a field where you will insert your own 16-bit IDs for your custom services and characteristics and use them just like a predefined UUID. This way you can store the base UUID once in memory, forget about it, and work with 16-bit IDs as normal.</w:t>
       </w:r>
     </w:p>
@@ -1313,14 +1162,8 @@
     <w:p>
       <w:pPr>
         <w:pStyle w:val="Heading4"/>
-        <w:rPr>
-          <w:color w:val="0D0D0D" w:themeColor="text1" w:themeTint="F2"/>
-        </w:rPr>
-      </w:pPr>
-      <w:r>
-        <w:rPr>
-          <w:color w:val="0D0D0D" w:themeColor="text1" w:themeTint="F2"/>
-        </w:rPr>
+      </w:pPr>
+      <w:r>
         <w:t>Let’s start by examining what constitutes a service and how attributes are hierarchically structured in a given service. As shown in the below figure, attributes are the main building blocks for services. A service definition (commonly referred to as a service) is comprised of multiple attributes arranged in a GATT-specified format which facilitates standardized data exchange between Bluetooth LE devices.</w:t>
       </w:r>
     </w:p>
@@ -1341,6 +1184,7 @@
       <w:r>
         <w:rPr>
           <w:rFonts w:ascii="Arial" w:hAnsi="Arial" w:cs="Arial"/>
+          <w:noProof/>
           <w:color w:val="4B4F58"/>
           <w:sz w:val="27"/>
           <w:szCs w:val="27"/>
@@ -1391,22 +1235,13 @@
           <w:numId w:val="0"/>
         </w:numPr>
         <w:ind w:left="300" w:hanging="300"/>
-        <w:rPr>
-          <w:color w:val="0D0D0D" w:themeColor="text1" w:themeTint="F2"/>
-        </w:rPr>
       </w:pPr>
     </w:p>
     <w:p>
       <w:pPr>
         <w:pStyle w:val="Heading5"/>
-        <w:rPr>
-          <w:color w:val="0D0D0D" w:themeColor="text1" w:themeTint="F2"/>
-        </w:rPr>
-      </w:pPr>
-      <w:r>
-        <w:rPr>
-          <w:color w:val="0D0D0D" w:themeColor="text1" w:themeTint="F2"/>
-        </w:rPr>
+      </w:pPr>
+      <w:r>
         <w:lastRenderedPageBreak/>
         <w:t>Service declaration attribute</w:t>
       </w:r>
@@ -1414,14 +1249,8 @@
     <w:p>
       <w:pPr>
         <w:pStyle w:val="Heading4"/>
-        <w:rPr>
-          <w:color w:val="0D0D0D" w:themeColor="text1" w:themeTint="F2"/>
-        </w:rPr>
-      </w:pPr>
-      <w:r>
-        <w:rPr>
-          <w:color w:val="0D0D0D" w:themeColor="text1" w:themeTint="F2"/>
-        </w:rPr>
+      </w:pPr>
+      <w:r>
         <w:t>Service definitions always start with a service declaration attribute. This attribute holds metadata about the service, it also indicates the beginning of a service in the sequence of services stored on a GATT server.</w:t>
       </w:r>
     </w:p>
@@ -1432,6 +1261,10 @@
         </w:rPr>
       </w:pPr>
       <w:r>
+        <w:rPr>
+          <w:noProof/>
+          <w:lang w:eastAsia="en-IN"/>
+        </w:rPr>
         <w:drawing>
           <wp:inline distT="0" distB="0" distL="0" distR="0" wp14:anchorId="6ED18594" wp14:editId="76FE712E">
             <wp:extent cx="5731510" cy="2430780"/>
@@ -1472,28 +1305,18 @@
     <w:p>
       <w:pPr>
         <w:pStyle w:val="Heading4"/>
-        <w:rPr>
-          <w:color w:val="0D0D0D" w:themeColor="text1" w:themeTint="F2"/>
-        </w:rPr>
-      </w:pPr>
-      <w:r>
-        <w:rPr>
-          <w:color w:val="0D0D0D" w:themeColor="text1" w:themeTint="F2"/>
-        </w:rPr>
+      </w:pPr>
+      <w:r>
         <w:t>The </w:t>
       </w:r>
       <w:r>
         <w:rPr>
           <w:rStyle w:val="Strong"/>
           <w:bCs w:val="0"/>
-          <w:color w:val="0D0D0D" w:themeColor="text1" w:themeTint="F2"/>
         </w:rPr>
         <w:t>Handle</w:t>
       </w:r>
       <w:r>
-        <w:rPr>
-          <w:color w:val="0D0D0D" w:themeColor="text1" w:themeTint="F2"/>
-        </w:rPr>
         <w:t> is similar to a row number by which the attribute is addressed. The service declaration attribute’s </w:t>
       </w:r>
       <w:r>
@@ -1501,51 +1324,36 @@
           <w:rStyle w:val="Strong"/>
           <w:b w:val="0"/>
           <w:bCs w:val="0"/>
-          <w:color w:val="0D0D0D" w:themeColor="text1" w:themeTint="F2"/>
         </w:rPr>
         <w:t>Type </w:t>
       </w:r>
       <w:r>
-        <w:rPr>
-          <w:color w:val="0D0D0D" w:themeColor="text1" w:themeTint="F2"/>
-        </w:rPr>
         <w:t>field holds the UUID (</w:t>
       </w:r>
       <w:r>
         <w:rPr>
           <w:rStyle w:val="HTMLCode"/>
           <w:rFonts w:ascii="Calibri" w:hAnsi="Calibri" w:cs="Calibri"/>
-          <w:color w:val="0D0D0D" w:themeColor="text1" w:themeTint="F2"/>
           <w:sz w:val="24"/>
           <w:szCs w:val="24"/>
         </w:rPr>
         <w:t>0x2800</w:t>
       </w:r>
       <w:r>
-        <w:rPr>
-          <w:color w:val="0D0D0D" w:themeColor="text1" w:themeTint="F2"/>
-        </w:rPr>
         <w:t>) which is a unique SIG-defined UUID used only to indicate the beginning of a service.</w:t>
       </w:r>
     </w:p>
     <w:p>
       <w:pPr>
         <w:pStyle w:val="Heading4"/>
-        <w:rPr>
-          <w:color w:val="0D0D0D" w:themeColor="text1" w:themeTint="F2"/>
-        </w:rPr>
-      </w:pPr>
-      <w:r>
-        <w:rPr>
-          <w:color w:val="0D0D0D" w:themeColor="text1" w:themeTint="F2"/>
-        </w:rPr>
+      </w:pPr>
+      <w:r>
         <w:t>The </w:t>
       </w:r>
       <w:r>
         <w:rPr>
           <w:rStyle w:val="Strong"/>
           <w:bCs w:val="0"/>
-          <w:color w:val="0D0D0D" w:themeColor="text1" w:themeTint="F2"/>
         </w:rPr>
         <w:t>Permissions</w:t>
       </w:r>
@@ -1554,35 +1362,24 @@
           <w:rStyle w:val="Strong"/>
           <w:b w:val="0"/>
           <w:bCs w:val="0"/>
-          <w:color w:val="0D0D0D" w:themeColor="text1" w:themeTint="F2"/>
         </w:rPr>
         <w:t> </w:t>
       </w:r>
       <w:r>
-        <w:rPr>
-          <w:color w:val="0D0D0D" w:themeColor="text1" w:themeTint="F2"/>
-        </w:rPr>
         <w:t>field here indicates “read only” and no authentication needed. This is expected in a service declaration attribute as there is no reason to have a write-permission for it, it only declares the beginning of a service.</w:t>
       </w:r>
     </w:p>
     <w:p>
       <w:pPr>
         <w:pStyle w:val="Heading4"/>
-        <w:rPr>
-          <w:color w:val="0D0D0D" w:themeColor="text1" w:themeTint="F2"/>
-        </w:rPr>
-      </w:pPr>
-      <w:r>
-        <w:rPr>
-          <w:color w:val="0D0D0D" w:themeColor="text1" w:themeTint="F2"/>
-        </w:rPr>
+      </w:pPr>
+      <w:r>
         <w:t>Lastly, the </w:t>
       </w:r>
       <w:r>
         <w:rPr>
           <w:rStyle w:val="Strong"/>
           <w:bCs w:val="0"/>
-          <w:color w:val="0D0D0D" w:themeColor="text1" w:themeTint="F2"/>
         </w:rPr>
         <w:t>Value</w:t>
       </w:r>
@@ -1591,30 +1388,22 @@
           <w:rStyle w:val="Strong"/>
           <w:b w:val="0"/>
           <w:bCs w:val="0"/>
-          <w:color w:val="0D0D0D" w:themeColor="text1" w:themeTint="F2"/>
         </w:rPr>
         <w:t> </w:t>
       </w:r>
       <w:r>
-        <w:rPr>
-          <w:color w:val="0D0D0D" w:themeColor="text1" w:themeTint="F2"/>
-        </w:rPr>
         <w:t>field holds the UUID of the service being declared. For example, the Heart Rate Service is a SIG-defined service and is referred to by the UUID </w:t>
       </w:r>
       <w:r>
         <w:rPr>
           <w:rStyle w:val="HTMLCode"/>
           <w:rFonts w:ascii="Calibri" w:hAnsi="Calibri" w:cs="Calibri"/>
-          <w:color w:val="0D0D0D" w:themeColor="text1" w:themeTint="F2"/>
           <w:sz w:val="24"/>
           <w:szCs w:val="24"/>
         </w:rPr>
         <w:t>0x180D</w:t>
       </w:r>
       <w:r>
-        <w:rPr>
-          <w:color w:val="0D0D0D" w:themeColor="text1" w:themeTint="F2"/>
-        </w:rPr>
         <w:t> which is stored in the Value field of the Heart Rate Service-Service declaration attribute.</w:t>
       </w:r>
     </w:p>
@@ -1636,14 +1425,8 @@
     <w:p>
       <w:pPr>
         <w:pStyle w:val="Heading4"/>
-        <w:rPr>
-          <w:color w:val="0D0D0D" w:themeColor="text1" w:themeTint="F2"/>
-        </w:rPr>
-      </w:pPr>
-      <w:r>
-        <w:rPr>
-          <w:color w:val="0D0D0D" w:themeColor="text1" w:themeTint="F2"/>
-        </w:rPr>
+      </w:pPr>
+      <w:r>
         <w:t>Subsequently, a service can have zero or more characteristic definitions (commonly referred to as characteristics). A characteristic is comprised of at least two attributes and optionally more.</w:t>
       </w:r>
     </w:p>
@@ -1656,6 +1439,7 @@
       </w:pPr>
       <w:r>
         <w:rPr>
+          <w:noProof/>
           <w:lang w:eastAsia="en-IN"/>
         </w:rPr>
         <w:lastRenderedPageBreak/>
@@ -1699,23 +1483,14 @@
     <w:p>
       <w:pPr>
         <w:pStyle w:val="Heading4"/>
-        <w:rPr>
-          <w:color w:val="0D0D0D" w:themeColor="text1" w:themeTint="F2"/>
-        </w:rPr>
-      </w:pPr>
-      <w:r>
-        <w:rPr>
-          <w:color w:val="0D0D0D" w:themeColor="text1" w:themeTint="F2"/>
-        </w:rPr>
+      </w:pPr>
+      <w:r>
         <w:t>Similar to a service definition, a characteristic definition starts with a declaration attribute, to indicate the beginning of a characteristic in the sequence of characteristics in a service definition. This is followed by the characteristic value attribute which holds the actual user data. Optionally, a characteristic can also have one or more characteristic descriptor attributes.</w:t>
       </w:r>
     </w:p>
     <w:p>
       <w:pPr>
         <w:pStyle w:val="Heading4"/>
-        <w:rPr>
-          <w:color w:val="0D0D0D" w:themeColor="text1" w:themeTint="F2"/>
-        </w:rPr>
       </w:pPr>
       <w:r>
         <w:rPr>
@@ -1735,18 +1510,12 @@
         <w:t>Characteristic declaration attribute</w:t>
       </w:r>
       <w:r>
-        <w:rPr>
-          <w:color w:val="0D0D0D" w:themeColor="text1" w:themeTint="F2"/>
-        </w:rPr>
         <w:t>: Holds metadata about the Characteristic Value Attribute.</w:t>
       </w:r>
     </w:p>
     <w:p>
       <w:pPr>
         <w:pStyle w:val="Heading4"/>
-        <w:rPr>
-          <w:color w:val="0D0D0D" w:themeColor="text1" w:themeTint="F2"/>
-        </w:rPr>
       </w:pPr>
       <w:r>
         <w:rPr>
@@ -1766,18 +1535,12 @@
         <w:t>Characteristic value attribute</w:t>
       </w:r>
       <w:r>
-        <w:rPr>
-          <w:color w:val="0D0D0D" w:themeColor="text1" w:themeTint="F2"/>
-        </w:rPr>
         <w:t>: Holds the actual user data.</w:t>
       </w:r>
     </w:p>
     <w:p>
       <w:pPr>
         <w:pStyle w:val="Heading4"/>
-        <w:rPr>
-          <w:color w:val="0D0D0D" w:themeColor="text1" w:themeTint="F2"/>
-        </w:rPr>
       </w:pPr>
       <w:r>
         <w:rPr>
@@ -1797,37 +1560,22 @@
         <w:t>Characteristic descriptor attribute</w:t>
       </w:r>
       <w:r>
-        <w:rPr>
-          <w:color w:val="0D0D0D" w:themeColor="text1" w:themeTint="F2"/>
-        </w:rPr>
         <w:t> (optional): Holds more metadata about the characteristic.</w:t>
       </w:r>
     </w:p>
     <w:p>
       <w:pPr>
         <w:pStyle w:val="Heading5"/>
-        <w:rPr>
-          <w:color w:val="0D0D0D" w:themeColor="text1" w:themeTint="F2"/>
-        </w:rPr>
-      </w:pPr>
-      <w:r>
-        <w:rPr>
-          <w:color w:val="0D0D0D" w:themeColor="text1" w:themeTint="F2"/>
-        </w:rPr>
+      </w:pPr>
+      <w:r>
         <w:t>Characteristic declaration attribute</w:t>
       </w:r>
     </w:p>
     <w:p>
       <w:pPr>
         <w:pStyle w:val="Heading4"/>
-        <w:rPr>
-          <w:color w:val="0D0D0D" w:themeColor="text1" w:themeTint="F2"/>
-        </w:rPr>
-      </w:pPr>
-      <w:r>
-        <w:rPr>
-          <w:color w:val="0D0D0D" w:themeColor="text1" w:themeTint="F2"/>
-        </w:rPr>
+      </w:pPr>
+      <w:r>
         <w:t>A characteristic definition starts with a characteristic declaration attribute, to indicate the beginning of a characteristic in the sequence of characteristics in a service definition. The characteristic declaration attribute’s </w:t>
       </w:r>
       <w:r>
@@ -1848,9 +1596,6 @@
         <w:t>Type </w:t>
       </w:r>
       <w:r>
-        <w:rPr>
-          <w:color w:val="0D0D0D" w:themeColor="text1" w:themeTint="F2"/>
-        </w:rPr>
         <w:t>field holds the UUID (</w:t>
       </w:r>
       <w:r>
@@ -1872,9 +1617,6 @@
         <w:t>0x2803</w:t>
       </w:r>
       <w:r>
-        <w:rPr>
-          <w:color w:val="0D0D0D" w:themeColor="text1" w:themeTint="F2"/>
-        </w:rPr>
         <w:t>) used only to declare a characteristic. The declaration attribute has read-only </w:t>
       </w:r>
       <w:r>
@@ -1895,9 +1637,6 @@
         <w:t>Permissions</w:t>
       </w:r>
       <w:r>
-        <w:rPr>
-          <w:color w:val="0D0D0D" w:themeColor="text1" w:themeTint="F2"/>
-        </w:rPr>
         <w:t>, ensuring that clients can read the value but not write to it.</w:t>
       </w:r>
     </w:p>
@@ -1910,6 +1649,7 @@
       </w:pPr>
       <w:r>
         <w:rPr>
+          <w:noProof/>
           <w:lang w:eastAsia="en-IN"/>
         </w:rPr>
         <w:drawing>
@@ -1952,14 +1692,8 @@
     <w:p>
       <w:pPr>
         <w:pStyle w:val="Heading4"/>
-        <w:rPr>
-          <w:color w:val="0D0D0D" w:themeColor="text1" w:themeTint="F2"/>
-        </w:rPr>
-      </w:pPr>
-      <w:r>
-        <w:rPr>
-          <w:color w:val="0D0D0D" w:themeColor="text1" w:themeTint="F2"/>
-        </w:rPr>
+      </w:pPr>
+      <w:r>
         <w:lastRenderedPageBreak/>
         <w:t>The </w:t>
       </w:r>
@@ -1981,18 +1715,12 @@
         <w:t>Value</w:t>
       </w:r>
       <w:r>
-        <w:rPr>
-          <w:color w:val="0D0D0D" w:themeColor="text1" w:themeTint="F2"/>
-        </w:rPr>
         <w:t> field holds important information about the characteristic being declared, specifically three separate fields:</w:t>
       </w:r>
     </w:p>
     <w:p>
       <w:pPr>
         <w:pStyle w:val="Heading4"/>
-        <w:rPr>
-          <w:color w:val="0D0D0D" w:themeColor="text1" w:themeTint="F2"/>
-        </w:rPr>
       </w:pPr>
       <w:r>
         <w:rPr>
@@ -2012,18 +1740,12 @@
         <w:t>Characteristic properties</w:t>
       </w:r>
       <w:r>
-        <w:rPr>
-          <w:color w:val="0D0D0D" w:themeColor="text1" w:themeTint="F2"/>
-        </w:rPr>
         <w:t>: What kind of GATT operations are permitted on this characteristic.</w:t>
       </w:r>
     </w:p>
     <w:p>
       <w:pPr>
         <w:pStyle w:val="Heading4"/>
-        <w:rPr>
-          <w:color w:val="0D0D0D" w:themeColor="text1" w:themeTint="F2"/>
-        </w:rPr>
       </w:pPr>
       <w:r>
         <w:rPr>
@@ -2043,32 +1765,20 @@
         <w:t>Characteristic value handle</w:t>
       </w:r>
       <w:r>
-        <w:rPr>
-          <w:color w:val="0D0D0D" w:themeColor="text1" w:themeTint="F2"/>
-        </w:rPr>
         <w:t xml:space="preserve">: The handle (address) of the attribute that contains the user data (value), </w:t>
       </w:r>
       <w:proofErr w:type="spellStart"/>
       <w:r>
-        <w:rPr>
-          <w:color w:val="0D0D0D" w:themeColor="text1" w:themeTint="F2"/>
-        </w:rPr>
         <w:t>i.e</w:t>
       </w:r>
       <w:proofErr w:type="spellEnd"/>
       <w:r>
-        <w:rPr>
-          <w:color w:val="0D0D0D" w:themeColor="text1" w:themeTint="F2"/>
-        </w:rPr>
         <w:t xml:space="preserve"> the characteristic value attribute.</w:t>
       </w:r>
     </w:p>
     <w:p>
       <w:pPr>
         <w:pStyle w:val="Heading4"/>
-        <w:rPr>
-          <w:color w:val="0D0D0D" w:themeColor="text1" w:themeTint="F2"/>
-        </w:rPr>
       </w:pPr>
       <w:r>
         <w:rPr>
@@ -2088,37 +1798,22 @@
         <w:t>Characteristic UUID</w:t>
       </w:r>
       <w:r>
-        <w:rPr>
-          <w:color w:val="0D0D0D" w:themeColor="text1" w:themeTint="F2"/>
-        </w:rPr>
         <w:t>: The UUID of the characteristic being declared.</w:t>
       </w:r>
     </w:p>
     <w:p>
       <w:pPr>
         <w:pStyle w:val="Heading5"/>
-        <w:rPr>
-          <w:color w:val="0D0D0D" w:themeColor="text1" w:themeTint="F2"/>
-        </w:rPr>
-      </w:pPr>
-      <w:r>
-        <w:rPr>
-          <w:color w:val="0D0D0D" w:themeColor="text1" w:themeTint="F2"/>
-        </w:rPr>
+      </w:pPr>
+      <w:r>
         <w:t>Characteristic value attribute</w:t>
       </w:r>
     </w:p>
     <w:p>
       <w:pPr>
         <w:pStyle w:val="Heading4"/>
-        <w:rPr>
-          <w:color w:val="0D0D0D" w:themeColor="text1" w:themeTint="F2"/>
-        </w:rPr>
-      </w:pPr>
-      <w:r>
-        <w:rPr>
-          <w:color w:val="0D0D0D" w:themeColor="text1" w:themeTint="F2"/>
-        </w:rPr>
+      </w:pPr>
+      <w:r>
         <w:t>After the attribute declaring the characteristic comes the characteristic value attribute. This is where the actual user data is stored. Its </w:t>
       </w:r>
       <w:r>
@@ -2139,9 +1834,6 @@
         <w:t>Handle </w:t>
       </w:r>
       <w:r>
-        <w:rPr>
-          <w:color w:val="0D0D0D" w:themeColor="text1" w:themeTint="F2"/>
-        </w:rPr>
         <w:t>and </w:t>
       </w:r>
       <w:r>
@@ -2162,9 +1854,6 @@
         <w:t>Type </w:t>
       </w:r>
       <w:r>
-        <w:rPr>
-          <w:color w:val="0D0D0D" w:themeColor="text1" w:themeTint="F2"/>
-        </w:rPr>
         <w:t>are the ones referred to in the Characteristic Declaration Attribute </w:t>
       </w:r>
       <w:r>
@@ -2185,9 +1874,6 @@
         <w:t>Value </w:t>
       </w:r>
       <w:r>
-        <w:rPr>
-          <w:color w:val="0D0D0D" w:themeColor="text1" w:themeTint="F2"/>
-        </w:rPr>
         <w:t>field. Naturally, its </w:t>
       </w:r>
       <w:r>
@@ -2208,9 +1894,6 @@
         <w:t>Value </w:t>
       </w:r>
       <w:r>
-        <w:rPr>
-          <w:color w:val="0D0D0D" w:themeColor="text1" w:themeTint="F2"/>
-        </w:rPr>
         <w:t>field is where the actual user data is stored. The </w:t>
       </w:r>
       <w:r>
@@ -2231,9 +1914,6 @@
         <w:t>Permissions</w:t>
       </w:r>
       <w:r>
-        <w:rPr>
-          <w:color w:val="0D0D0D" w:themeColor="text1" w:themeTint="F2"/>
-        </w:rPr>
         <w:t> field indicates whether the client can read and/or write to this attribute.</w:t>
       </w:r>
     </w:p>
@@ -2244,6 +1924,10 @@
         </w:rPr>
       </w:pPr>
       <w:r>
+        <w:rPr>
+          <w:noProof/>
+          <w:lang w:eastAsia="en-IN"/>
+        </w:rPr>
         <w:drawing>
           <wp:inline distT="0" distB="0" distL="0" distR="0" wp14:anchorId="486EF205" wp14:editId="63477DBC">
             <wp:extent cx="5731510" cy="3404235"/>
@@ -2291,14 +1975,8 @@
     <w:p>
       <w:pPr>
         <w:pStyle w:val="Heading5"/>
-        <w:rPr>
-          <w:color w:val="0D0D0D" w:themeColor="text1" w:themeTint="F2"/>
-        </w:rPr>
-      </w:pPr>
-      <w:r>
-        <w:rPr>
-          <w:color w:val="0D0D0D" w:themeColor="text1" w:themeTint="F2"/>
-        </w:rPr>
+      </w:pPr>
+      <w:r>
         <w:t>Characteristic descriptors</w:t>
       </w:r>
     </w:p>
@@ -2318,7 +1996,6 @@
       <w:r>
         <w:rPr>
           <w:rStyle w:val="Heading4Char"/>
-          <w:color w:val="0D0D0D" w:themeColor="text1" w:themeTint="F2"/>
         </w:rPr>
         <w:t>The characteristic descriptor attributes are optional. They hold additional metadata about the characteristic, giving the client more information about the nature of the characteristic. There are several kinds of descriptors, but they are generally divided into two categories, GATT-defined and custom</w:t>
       </w:r>
@@ -2362,6 +2039,7 @@
       <w:r>
         <w:rPr>
           <w:rFonts w:ascii="Arial" w:hAnsi="Arial" w:cs="Arial"/>
+          <w:noProof/>
           <w:color w:val="4B4F58"/>
           <w:sz w:val="27"/>
           <w:szCs w:val="27"/>
@@ -2407,14 +2085,8 @@
     <w:p>
       <w:pPr>
         <w:pStyle w:val="Heading4"/>
-        <w:rPr>
-          <w:color w:val="0D0D0D" w:themeColor="text1" w:themeTint="F2"/>
-        </w:rPr>
-      </w:pPr>
-      <w:r>
-        <w:rPr>
-          <w:color w:val="0D0D0D" w:themeColor="text1" w:themeTint="F2"/>
-        </w:rPr>
+      </w:pPr>
+      <w:r>
         <w:t>Descriptors also allow the client to set permissions for certain server-initiated GATT operations</w:t>
       </w:r>
     </w:p>
@@ -2429,48 +2101,27 @@
     <w:p>
       <w:pPr>
         <w:pStyle w:val="Heading4"/>
-        <w:rPr>
-          <w:color w:val="0D0D0D" w:themeColor="text1" w:themeTint="F2"/>
-        </w:rPr>
-      </w:pPr>
-      <w:r>
-        <w:rPr>
-          <w:color w:val="0D0D0D" w:themeColor="text1" w:themeTint="F2"/>
-        </w:rPr>
+      </w:pPr>
+      <w:r>
         <w:t>The Client characteristic configuration descriptor (CCCD) is a specific type of characteristic descriptor that is necessary when the characteristic supports server-initiated operations (</w:t>
       </w:r>
       <w:proofErr w:type="spellStart"/>
       <w:r>
-        <w:rPr>
-          <w:color w:val="0D0D0D" w:themeColor="text1" w:themeTint="F2"/>
-        </w:rPr>
         <w:t>i.e</w:t>
       </w:r>
       <w:proofErr w:type="spellEnd"/>
       <w:r>
-        <w:rPr>
-          <w:color w:val="0D0D0D" w:themeColor="text1" w:themeTint="F2"/>
-        </w:rPr>
         <w:t xml:space="preserve"> Notify and Indicate). This is a writable descriptor that allows the GATT client to enable and disable notifications or indications for that characteristic. The GATT client can subscribe to the characteristic that it wishes to receive updates about, by enabling either Indications or Notifications in the CCCD of that specific characteristic.</w:t>
       </w:r>
     </w:p>
     <w:p>
       <w:pPr>
         <w:pStyle w:val="Heading4"/>
-        <w:rPr>
-          <w:color w:val="0D0D0D" w:themeColor="text1" w:themeTint="F2"/>
-        </w:rPr>
-      </w:pPr>
-      <w:r>
-        <w:rPr>
-          <w:color w:val="0D0D0D" w:themeColor="text1" w:themeTint="F2"/>
-        </w:rPr>
+      </w:pPr>
+      <w:r>
         <w:t xml:space="preserve">For example, in the Heart Rate Service, there is a characteristic called the Heart Rate Measurement. The GATT client (your mobile phone for instance) can use the CCCD of this characteristic to receive updates about this characteristic. So it subscribes to the Heart Rate Measurement characteristic by enabling either Indications or Notifications in the CCCD of said characteristic. This means the GATT server (most </w:t>
       </w:r>
       <w:r>
-        <w:rPr>
-          <w:color w:val="0D0D0D" w:themeColor="text1" w:themeTint="F2"/>
-        </w:rPr>
         <w:lastRenderedPageBreak/>
         <w:t>likely a heart rate sensor device) will push these measurements to your phone, without your phone having to poll for these measurements.</w:t>
       </w:r>
@@ -2478,14 +2129,8 @@
     <w:p>
       <w:pPr>
         <w:pStyle w:val="Heading4"/>
-        <w:rPr>
-          <w:color w:val="0D0D0D" w:themeColor="text1" w:themeTint="F2"/>
-        </w:rPr>
-      </w:pPr>
-      <w:r>
-        <w:rPr>
-          <w:color w:val="0D0D0D" w:themeColor="text1" w:themeTint="F2"/>
-        </w:rPr>
+      </w:pPr>
+      <w:r>
         <w:t>The CCCD attribute’s format is as pictured below. The UUID for CCCDs is </w:t>
       </w:r>
       <w:r>
@@ -2507,9 +2152,6 @@
         <w:t>0x2902</w:t>
       </w:r>
       <w:r>
-        <w:rPr>
-          <w:color w:val="0D0D0D" w:themeColor="text1" w:themeTint="F2"/>
-        </w:rPr>
         <w:t>. A CCCD must always be readable and writable. Descriptors with the </w:t>
       </w:r>
       <w:r>
@@ -2531,9 +2173,6 @@
         <w:t>Type </w:t>
       </w:r>
       <w:r>
-        <w:rPr>
-          <w:color w:val="0D0D0D" w:themeColor="text1" w:themeTint="F2"/>
-        </w:rPr>
         <w:t>CCCD only have 2 bits in their </w:t>
       </w:r>
       <w:r>
@@ -2555,9 +2194,6 @@
         <w:t>Value </w:t>
       </w:r>
       <w:r>
-        <w:rPr>
-          <w:color w:val="0D0D0D" w:themeColor="text1" w:themeTint="F2"/>
-        </w:rPr>
         <w:t>field. The first bit signals whether Notifications are enabled, and the second bit is for Indications.</w:t>
       </w:r>
     </w:p>
@@ -2570,6 +2206,7 @@
       </w:pPr>
       <w:r>
         <w:rPr>
+          <w:noProof/>
           <w:lang w:eastAsia="en-IN"/>
         </w:rPr>
         <w:drawing>
@@ -2767,14 +2404,8 @@
     <w:p>
       <w:pPr>
         <w:pStyle w:val="Heading4"/>
-        <w:rPr>
-          <w:color w:val="0D0D0D" w:themeColor="text1" w:themeTint="F2"/>
-        </w:rPr>
-      </w:pPr>
-      <w:r>
-        <w:rPr>
-          <w:color w:val="0D0D0D" w:themeColor="text1" w:themeTint="F2"/>
-        </w:rPr>
+      </w:pPr>
+      <w:r>
         <w:t>To best visualize how attributes are stored in a GATT server, let’s examine an example attribute table. An attribute table is how attributes are stored in the GATT server. The attribute table below is derived from a custom service that we will create in exercise 2 of this lesson.</w:t>
       </w:r>
     </w:p>
@@ -2783,6 +2414,10 @@
         <w:jc w:val="center"/>
       </w:pPr>
       <w:r>
+        <w:rPr>
+          <w:noProof/>
+          <w:lang w:eastAsia="en-IN"/>
+        </w:rPr>
         <w:drawing>
           <wp:inline distT="0" distB="0" distL="0" distR="0" wp14:anchorId="7FFAD20C" wp14:editId="77143775">
             <wp:extent cx="4148997" cy="4019341"/>
@@ -2828,92 +2463,53 @@
     <w:p>
       <w:pPr>
         <w:pStyle w:val="Heading4"/>
-        <w:rPr>
-          <w:color w:val="0D0D0D" w:themeColor="text1" w:themeTint="F2"/>
-        </w:rPr>
-      </w:pPr>
-      <w:r>
-        <w:rPr>
-          <w:color w:val="0D0D0D" w:themeColor="text1" w:themeTint="F2"/>
-        </w:rPr>
+      </w:pPr>
+      <w:r>
         <w:t>This attribute table depicts a custom service called “</w:t>
       </w:r>
       <w:proofErr w:type="spellStart"/>
       <w:r>
-        <w:rPr>
-          <w:color w:val="0D0D0D" w:themeColor="text1" w:themeTint="F2"/>
-        </w:rPr>
         <w:t>my_lbs</w:t>
       </w:r>
       <w:proofErr w:type="spellEnd"/>
       <w:r>
-        <w:rPr>
-          <w:color w:val="0D0D0D" w:themeColor="text1" w:themeTint="F2"/>
-        </w:rPr>
         <w:t xml:space="preserve">”. The </w:t>
       </w:r>
       <w:proofErr w:type="spellStart"/>
       <w:r>
-        <w:rPr>
-          <w:color w:val="0D0D0D" w:themeColor="text1" w:themeTint="F2"/>
-        </w:rPr>
         <w:t>my_lbs</w:t>
       </w:r>
       <w:proofErr w:type="spellEnd"/>
       <w:r>
-        <w:rPr>
-          <w:color w:val="0D0D0D" w:themeColor="text1" w:themeTint="F2"/>
-        </w:rPr>
         <w:t xml:space="preserve"> service holds three characteristics:</w:t>
       </w:r>
     </w:p>
     <w:p>
       <w:pPr>
         <w:pStyle w:val="Heading6"/>
-        <w:rPr>
-          <w:color w:val="0D0D0D" w:themeColor="text1" w:themeTint="F2"/>
-        </w:rPr>
-      </w:pPr>
-      <w:r>
-        <w:rPr>
-          <w:color w:val="0D0D0D" w:themeColor="text1" w:themeTint="F2"/>
-        </w:rPr>
+      </w:pPr>
+      <w:r>
         <w:t>Button Characteristic</w:t>
       </w:r>
     </w:p>
     <w:p>
       <w:pPr>
         <w:pStyle w:val="Heading6"/>
-        <w:rPr>
-          <w:color w:val="0D0D0D" w:themeColor="text1" w:themeTint="F2"/>
-        </w:rPr>
-      </w:pPr>
-      <w:r>
-        <w:rPr>
-          <w:color w:val="0D0D0D" w:themeColor="text1" w:themeTint="F2"/>
-        </w:rPr>
+      </w:pPr>
+      <w:r>
         <w:t>LED Characteristic</w:t>
       </w:r>
     </w:p>
     <w:p>
       <w:pPr>
         <w:pStyle w:val="Heading6"/>
-        <w:rPr>
-          <w:color w:val="0D0D0D" w:themeColor="text1" w:themeTint="F2"/>
-        </w:rPr>
       </w:pPr>
       <w:proofErr w:type="spellStart"/>
       <w:r>
-        <w:rPr>
-          <w:color w:val="0D0D0D" w:themeColor="text1" w:themeTint="F2"/>
-        </w:rPr>
         <w:t>MySensor</w:t>
       </w:r>
       <w:proofErr w:type="spellEnd"/>
       <w:r>
-        <w:rPr>
-          <w:color w:val="0D0D0D" w:themeColor="text1" w:themeTint="F2"/>
-        </w:rPr>
         <w:t xml:space="preserve"> Characteristic</w:t>
       </w:r>
     </w:p>
@@ -2928,14 +2524,8 @@
     <w:p>
       <w:pPr>
         <w:pStyle w:val="Heading4"/>
-        <w:rPr>
-          <w:color w:val="0D0D0D" w:themeColor="text1" w:themeTint="F2"/>
-        </w:rPr>
-      </w:pPr>
-      <w:r>
-        <w:rPr>
-          <w:color w:val="0D0D0D" w:themeColor="text1" w:themeTint="F2"/>
-        </w:rPr>
+      </w:pPr>
+      <w:r>
         <w:t>The first line in the table declares this service with a service declaration attribute. As previously discussed, the Type field in a declaration attribute holds a unique SIG-defined value, and for service declarations, the UUID is </w:t>
       </w:r>
       <w:r>
@@ -2957,15 +2547,9 @@
         <w:t>0x2800</w:t>
       </w:r>
       <w:r>
-        <w:rPr>
-          <w:color w:val="0D0D0D" w:themeColor="text1" w:themeTint="F2"/>
-        </w:rPr>
         <w:t xml:space="preserve">. There is no reason to write to a declaration attribute, therefore its permissions are always Read-only. </w:t>
       </w:r>
       <w:r>
-        <w:rPr>
-          <w:color w:val="0D0D0D" w:themeColor="text1" w:themeTint="F2"/>
-        </w:rPr>
         <w:lastRenderedPageBreak/>
         <w:t>Lastly, the value field of the service declaration attribute holds the UUID of the service it’s declaring.</w:t>
       </w:r>
@@ -2979,6 +2563,7 @@
       </w:pPr>
       <w:r>
         <w:rPr>
+          <w:noProof/>
           <w:lang w:eastAsia="en-IN"/>
         </w:rPr>
         <w:drawing>
@@ -3046,14 +2631,8 @@
     <w:p>
       <w:pPr>
         <w:pStyle w:val="Heading4"/>
-        <w:rPr>
-          <w:color w:val="0D0D0D" w:themeColor="text1" w:themeTint="F2"/>
-        </w:rPr>
-      </w:pPr>
-      <w:r>
-        <w:rPr>
-          <w:color w:val="0D0D0D" w:themeColor="text1" w:themeTint="F2"/>
-        </w:rPr>
+      </w:pPr>
+      <w:r>
         <w:t>The Button characteristic is defined first. The Button characteristic is first declared with the Button Characteristic Declaration. The Type field of a characteristic declaration attribute is always </w:t>
       </w:r>
       <w:r>
@@ -3075,37 +2654,22 @@
         <w:t>0x2803</w:t>
       </w:r>
       <w:r>
-        <w:rPr>
-          <w:color w:val="0D0D0D" w:themeColor="text1" w:themeTint="F2"/>
-        </w:rPr>
         <w:t> to declare a characteristic and the permissions are always Read-only. The Value field holds the handle of the value attribute, properties, and the UUID of the characteristic it’s declaring.</w:t>
       </w:r>
     </w:p>
     <w:p>
       <w:pPr>
         <w:pStyle w:val="Heading4"/>
-        <w:rPr>
-          <w:color w:val="0D0D0D" w:themeColor="text1" w:themeTint="F2"/>
-        </w:rPr>
-      </w:pPr>
-      <w:r>
-        <w:rPr>
-          <w:color w:val="0D0D0D" w:themeColor="text1" w:themeTint="F2"/>
-        </w:rPr>
+      </w:pPr>
+      <w:r>
         <w:t>Then comes the button characteristic value attribute which holds the actual user data, in this case, whether the button is pushed or not.</w:t>
       </w:r>
     </w:p>
     <w:p>
       <w:pPr>
         <w:pStyle w:val="Heading4"/>
-        <w:rPr>
-          <w:color w:val="0D0D0D" w:themeColor="text1" w:themeTint="F2"/>
-        </w:rPr>
-      </w:pPr>
-      <w:r>
-        <w:rPr>
-          <w:color w:val="0D0D0D" w:themeColor="text1" w:themeTint="F2"/>
-        </w:rPr>
+      </w:pPr>
+      <w:r>
         <w:t>Lastly, since the button characteristic supports the Indicate operation, there is a CCCD to enable indications for the Button characteristic. The CCCD will always have the UUID </w:t>
       </w:r>
       <w:r>
@@ -3127,56 +2691,39 @@
         <w:t>0x2902</w:t>
       </w:r>
       <w:r>
-        <w:rPr>
-          <w:color w:val="0D0D0D" w:themeColor="text1" w:themeTint="F2"/>
-        </w:rPr>
         <w:t> and the permission to Read and write. In this specific table, we can see that the Indicate bit-field has been enabled. Notice that the CCCD isn’t referenced in the characteristic declaration like the value declaration is, but can be recognized by the distinct UUID.</w:t>
       </w:r>
     </w:p>
     <w:p>
       <w:pPr>
         <w:pStyle w:val="Heading4"/>
-        <w:rPr>
-          <w:color w:val="0D0D0D" w:themeColor="text1" w:themeTint="F2"/>
-        </w:rPr>
-      </w:pPr>
-      <w:r>
-        <w:rPr>
-          <w:color w:val="0D0D0D" w:themeColor="text1" w:themeTint="F2"/>
-        </w:rPr>
+      </w:pPr>
+      <w:r>
         <w:t xml:space="preserve">Even though it is not </w:t>
       </w:r>
       <w:proofErr w:type="spellStart"/>
       <w:r>
-        <w:rPr>
-          <w:color w:val="0D0D0D" w:themeColor="text1" w:themeTint="F2"/>
-        </w:rPr>
         <w:t>refenced</w:t>
       </w:r>
       <w:proofErr w:type="spellEnd"/>
       <w:r>
-        <w:rPr>
-          <w:color w:val="0D0D0D" w:themeColor="text1" w:themeTint="F2"/>
-        </w:rPr>
         <w:t xml:space="preserve"> in the characteristic declaration, the central knows which characteristic it belongs to </w:t>
       </w:r>
       <w:proofErr w:type="spellStart"/>
       <w:r>
-        <w:rPr>
-          <w:color w:val="0D0D0D" w:themeColor="text1" w:themeTint="F2"/>
-        </w:rPr>
         <w:t>based</w:t>
       </w:r>
       <w:proofErr w:type="spellEnd"/>
       <w:r>
-        <w:rPr>
-          <w:color w:val="0D0D0D" w:themeColor="text1" w:themeTint="F2"/>
-        </w:rPr>
         <w:t xml:space="preserve"> on the handle, because it is listed “under” the characteristic declaration. All items under the characteristic declaration belong to that specific characteristic until there is a new characteristic declaration (UUID 0x2803) in the list.</w:t>
       </w:r>
     </w:p>
     <w:p>
       <w:r>
+        <w:rPr>
+          <w:noProof/>
+          <w:lang w:eastAsia="en-IN"/>
+        </w:rPr>
         <w:drawing>
           <wp:inline distT="0" distB="0" distL="0" distR="0" wp14:anchorId="056183D1" wp14:editId="09D789DC">
             <wp:extent cx="5731510" cy="2058035"/>
@@ -3253,6 +2800,10 @@
     </w:p>
     <w:p>
       <w:r>
+        <w:rPr>
+          <w:noProof/>
+          <w:lang w:eastAsia="en-IN"/>
+        </w:rPr>
         <w:drawing>
           <wp:inline distT="0" distB="0" distL="0" distR="0" wp14:anchorId="101DAEA6" wp14:editId="69E6D6D0">
             <wp:extent cx="5731510" cy="1721485"/>
@@ -3388,6 +2939,10 @@
     </w:p>
     <w:p>
       <w:r>
+        <w:rPr>
+          <w:noProof/>
+          <w:lang w:eastAsia="en-IN"/>
+        </w:rPr>
         <w:drawing>
           <wp:inline distT="0" distB="0" distL="0" distR="0" wp14:anchorId="653ECCA2" wp14:editId="2664DBA6">
             <wp:extent cx="5731510" cy="2043430"/>
@@ -3424,9 +2979,787 @@
           </wp:inline>
         </w:drawing>
       </w:r>
+    </w:p>
+    <w:p/>
+    <w:p/>
+    <w:p/>
+    <w:p/>
+    <w:p/>
+    <w:p/>
+    <w:p/>
+    <w:p/>
+    <w:p>
+      <w:pPr>
+        <w:pStyle w:val="Heading1"/>
+      </w:pPr>
+      <w:r>
+        <w:lastRenderedPageBreak/>
+        <w:t>Pairing process</w:t>
+      </w:r>
+    </w:p>
+    <w:p>
+      <w:pPr>
+        <w:pStyle w:val="Heading4"/>
+      </w:pPr>
+      <w:r>
+        <w:t>To encrypt the link, both peers need to have the same keys. The process of generating, distributing, and authenticating these keys for encryption is referred to as the pairing process.</w:t>
+      </w:r>
+    </w:p>
+    <w:p>
+      <w:pPr>
+        <w:pStyle w:val="Heading4"/>
+      </w:pPr>
+      <w:r>
+        <w:t>The pairing process requires the devices to repeat the process every time they want to encrypt the link again. In addition to “pairing”, the term “bonding” is used when the peers store the encryption key so they can re-encrypt the link in future connections with the same peer. During bonding, they can also exchange and store identity keys so they can recognize each other for future connections through the random resolvable private address.</w:t>
+      </w:r>
+    </w:p>
+    <w:p>
+      <w:pPr>
+        <w:pStyle w:val="Heading3"/>
+      </w:pPr>
+      <w:r>
+        <w:t>Bluetooth LE defines 3 phases in the encryption process.</w:t>
+      </w:r>
+    </w:p>
+    <w:p>
+      <w:pPr>
+        <w:pStyle w:val="Heading5"/>
+      </w:pPr>
+      <w:r>
+        <w:t>Phase 1: Initiate pairing</w:t>
+      </w:r>
+    </w:p>
+    <w:p>
+      <w:pPr>
+        <w:pStyle w:val="Heading4"/>
+      </w:pPr>
+      <w:r>
+        <w:t xml:space="preserve">To initiate the pairing and, in some cases, the bonding process, the central needs to send a Pairing Request and the peripheral responds with a Pairing Response. In this phase, the two devices exchange their pairing </w:t>
+      </w:r>
+      <w:proofErr w:type="gramStart"/>
+      <w:r>
+        <w:t>features, that</w:t>
+      </w:r>
+      <w:proofErr w:type="gramEnd"/>
+      <w:r>
+        <w:t xml:space="preserve"> will be used to determine what pairing method they will use in phase 2 and what keys are distributed in phase 3.</w:t>
+      </w:r>
+    </w:p>
+    <w:p>
+      <w:pPr>
+        <w:pStyle w:val="Heading4"/>
+      </w:pPr>
+      <w:r>
+        <w:t>Most importantly, the peers exchange their I/O (input/output) capabilities, selected from one of the following</w:t>
+      </w:r>
+    </w:p>
+    <w:p>
+      <w:pPr>
+        <w:pStyle w:val="Heading6"/>
+      </w:pPr>
+      <w:proofErr w:type="spellStart"/>
+      <w:r>
+        <w:rPr>
+          <w:rStyle w:val="Strong"/>
+          <w:rFonts w:ascii="Arial" w:hAnsi="Arial" w:cs="Arial"/>
+          <w:color w:val="4B4F58"/>
+          <w:sz w:val="27"/>
+          <w:szCs w:val="27"/>
+        </w:rPr>
+        <w:t>DisplayOnly</w:t>
+      </w:r>
+      <w:proofErr w:type="spellEnd"/>
+      <w:r>
+        <w:t>: The peer only has a display</w:t>
+      </w:r>
+    </w:p>
+    <w:p>
+      <w:pPr>
+        <w:pStyle w:val="Heading6"/>
+      </w:pPr>
+      <w:proofErr w:type="spellStart"/>
+      <w:r>
+        <w:rPr>
+          <w:rStyle w:val="Strong"/>
+          <w:rFonts w:ascii="Arial" w:hAnsi="Arial" w:cs="Arial"/>
+          <w:color w:val="4B4F58"/>
+          <w:sz w:val="27"/>
+          <w:szCs w:val="27"/>
+        </w:rPr>
+        <w:t>DisplayYesNo</w:t>
+      </w:r>
+      <w:proofErr w:type="spellEnd"/>
+      <w:r>
+        <w:t>: The peer has a display and the option to select “yes” or “no”</w:t>
+      </w:r>
+    </w:p>
+    <w:p>
+      <w:pPr>
+        <w:pStyle w:val="Heading6"/>
+      </w:pPr>
+      <w:proofErr w:type="spellStart"/>
+      <w:r>
+        <w:rPr>
+          <w:rStyle w:val="Strong"/>
+          <w:rFonts w:ascii="Arial" w:hAnsi="Arial" w:cs="Arial"/>
+          <w:color w:val="4B4F58"/>
+          <w:sz w:val="27"/>
+          <w:szCs w:val="27"/>
+        </w:rPr>
+        <w:t>KeyboardOnly</w:t>
+      </w:r>
+      <w:proofErr w:type="spellEnd"/>
+      <w:r>
+        <w:t>: The peer has keyboard only</w:t>
+      </w:r>
+    </w:p>
+    <w:p>
+      <w:pPr>
+        <w:pStyle w:val="Heading6"/>
+      </w:pPr>
+      <w:proofErr w:type="spellStart"/>
+      <w:r>
+        <w:rPr>
+          <w:rStyle w:val="Strong"/>
+          <w:rFonts w:ascii="Arial" w:hAnsi="Arial" w:cs="Arial"/>
+          <w:color w:val="4B4F58"/>
+          <w:sz w:val="27"/>
+          <w:szCs w:val="27"/>
+        </w:rPr>
+        <w:t>NoInputNoOutput</w:t>
+      </w:r>
+      <w:proofErr w:type="spellEnd"/>
+      <w:r>
+        <w:t>: The peer has no input and no output capabilities</w:t>
+      </w:r>
+    </w:p>
+    <w:p>
+      <w:pPr>
+        <w:pStyle w:val="Heading6"/>
+      </w:pPr>
+      <w:proofErr w:type="spellStart"/>
+      <w:r>
+        <w:rPr>
+          <w:rStyle w:val="Strong"/>
+          <w:rFonts w:ascii="Arial" w:hAnsi="Arial" w:cs="Arial"/>
+          <w:color w:val="4B4F58"/>
+          <w:sz w:val="27"/>
+          <w:szCs w:val="27"/>
+        </w:rPr>
+        <w:t>KeyboardDisplay</w:t>
+      </w:r>
+      <w:proofErr w:type="spellEnd"/>
+      <w:r>
+        <w:t>: The peer has keyboard and display capabilities</w:t>
+      </w:r>
+    </w:p>
+    <w:p>
+      <w:pPr>
+        <w:pStyle w:val="Heading4"/>
+      </w:pPr>
+      <w:r>
+        <w:t>In addition, they exchange what security features they support, whether or not bonding is requested, and more.</w:t>
+      </w:r>
+    </w:p>
+    <w:p>
+      <w:pPr>
+        <w:pStyle w:val="Heading4"/>
+        <w:rPr>
+          <w:shd w:val="clear" w:color="auto" w:fill="FFFFFF"/>
+        </w:rPr>
+      </w:pPr>
+      <w:r>
+        <w:rPr>
+          <w:shd w:val="clear" w:color="auto" w:fill="FFFFFF"/>
+        </w:rPr>
+        <w:t>Only the central can send a Pairing Request. The peripheral, however, can send a Security Request which can trigger a Pairing Request from the central, but it’s not a common practice.</w:t>
+      </w:r>
+    </w:p>
+    <w:p>
+      <w:pPr>
+        <w:rPr>
+          <w:lang w:eastAsia="en-IN"/>
+        </w:rPr>
+      </w:pPr>
+    </w:p>
+    <w:p>
+      <w:pPr>
+        <w:rPr>
+          <w:lang w:eastAsia="en-IN"/>
+        </w:rPr>
+      </w:pPr>
+    </w:p>
+    <w:p>
+      <w:pPr>
+        <w:pStyle w:val="Heading5"/>
+      </w:pPr>
+      <w:r>
+        <w:lastRenderedPageBreak/>
+        <w:t>Phase 2: Perform pairing</w:t>
+      </w:r>
+    </w:p>
+    <w:p>
+      <w:pPr>
+        <w:rPr>
+          <w:lang w:eastAsia="en-IN"/>
+        </w:rPr>
+      </w:pPr>
+    </w:p>
+    <w:p>
+      <w:pPr>
+        <w:pStyle w:val="Heading4"/>
+      </w:pPr>
+      <w:r>
+        <w:t>In phase 2, the keys used to encrypt the connection are generated. The pairing method used here depends on the information exchanged in phase 1.</w:t>
+      </w:r>
+    </w:p>
+    <w:p>
+      <w:pPr>
+        <w:pStyle w:val="Heading4"/>
+      </w:pPr>
+      <w:r>
+        <w:t>In LE Legacy pairing, the peers exchange a Temporary Key (TK) used to generate a Short Term Key (STK) that is then used to encrypt the link. However, since the STK can easily be cracked, Bluetooth v4.2 introduced something called Bluetooth LE Secure Connections. In LE Secure Connections, the devices generate and exchange a more secure type of key, and use it to generate a single Long Term Key (LTK) used to encrypt the connection. See </w:t>
+      </w:r>
+      <w:hyperlink r:id="rId20" w:tgtFrame="_blank" w:history="1">
+        <w:r>
+          <w:rPr>
+            <w:rStyle w:val="Hyperlink"/>
+            <w:rFonts w:ascii="Arial" w:hAnsi="Arial" w:cs="Arial"/>
+            <w:color w:val="0170B9"/>
+            <w:sz w:val="27"/>
+            <w:szCs w:val="27"/>
+          </w:rPr>
+          <w:t xml:space="preserve">Legacy pairing </w:t>
+        </w:r>
+        <w:proofErr w:type="spellStart"/>
+        <w:r>
+          <w:rPr>
+            <w:rStyle w:val="Hyperlink"/>
+            <w:rFonts w:ascii="Arial" w:hAnsi="Arial" w:cs="Arial"/>
+            <w:color w:val="0170B9"/>
+            <w:sz w:val="27"/>
+            <w:szCs w:val="27"/>
+          </w:rPr>
+          <w:t>vs</w:t>
+        </w:r>
+        <w:proofErr w:type="spellEnd"/>
+        <w:r>
+          <w:rPr>
+            <w:rStyle w:val="Hyperlink"/>
+            <w:rFonts w:ascii="Arial" w:hAnsi="Arial" w:cs="Arial"/>
+            <w:color w:val="0170B9"/>
+            <w:sz w:val="27"/>
+            <w:szCs w:val="27"/>
+          </w:rPr>
+          <w:t xml:space="preserve"> LE Secure Connections</w:t>
+        </w:r>
+      </w:hyperlink>
+      <w:r>
+        <w:t> later in this lesson for more information on the difference between these two security methods.</w:t>
+      </w:r>
+    </w:p>
+    <w:p>
+      <w:pPr>
+        <w:pStyle w:val="Heading4"/>
+      </w:pPr>
+      <w:r>
+        <w:t>Legacy pairing defines three different methods to exchange the TK, called pairing methods. LE Secure Connections supports these three pairing methods but also a fourth (numeric comparison) that is not supported in Legacy pairing. The security of the pairing process depends on which pairing method is used in this phase.</w:t>
+      </w:r>
+    </w:p>
+    <w:p>
+      <w:pPr>
+        <w:pStyle w:val="Heading4"/>
+        <w:spacing w:before="270" w:after="270" w:line="330" w:lineRule="atLeast"/>
+        <w:rPr>
+          <w:rFonts w:ascii="Arial" w:hAnsi="Arial" w:cs="Arial"/>
+          <w:color w:val="333F48"/>
+          <w:sz w:val="27"/>
+          <w:szCs w:val="27"/>
+        </w:rPr>
+      </w:pPr>
+      <w:r>
+        <w:rPr>
+          <w:rFonts w:ascii="Arial" w:hAnsi="Arial" w:cs="Arial"/>
+          <w:b/>
+          <w:bCs/>
+          <w:color w:val="333F48"/>
+          <w:sz w:val="27"/>
+          <w:szCs w:val="27"/>
+        </w:rPr>
+        <w:t>Pairing methods</w:t>
+      </w:r>
+    </w:p>
+    <w:p>
+      <w:pPr>
+        <w:pStyle w:val="Heading6"/>
+      </w:pPr>
+      <w:r>
+        <w:rPr>
+          <w:rStyle w:val="Strong"/>
+          <w:color w:val="4B4F58"/>
+          <w:sz w:val="27"/>
+          <w:szCs w:val="27"/>
+        </w:rPr>
+        <w:t>Just Works</w:t>
+      </w:r>
+      <w:r>
+        <w:t>: Both peers generate the STK based on information exchanged in plain text, and the user is just asked to accept the connection. This method is unauthenticated.</w:t>
+      </w:r>
+    </w:p>
+    <w:p>
+      <w:pPr>
+        <w:pStyle w:val="Heading6"/>
+      </w:pPr>
+      <w:r>
+        <w:rPr>
+          <w:rStyle w:val="Strong"/>
+          <w:color w:val="4B4F58"/>
+          <w:sz w:val="27"/>
+          <w:szCs w:val="27"/>
+        </w:rPr>
+        <w:t>Passkey Entry</w:t>
+      </w:r>
+      <w:r>
+        <w:t>: 6-digit number is displayed on one device, and needs to be typed in on the other device. The I/O capabilities of the devices determine which one displays the number and which one inputs it.</w:t>
+      </w:r>
+    </w:p>
+    <w:p>
+      <w:pPr>
+        <w:pStyle w:val="Heading6"/>
+      </w:pPr>
+      <w:r>
+        <w:rPr>
+          <w:rStyle w:val="Strong"/>
+          <w:color w:val="4B4F58"/>
+          <w:sz w:val="27"/>
+          <w:szCs w:val="27"/>
+        </w:rPr>
+        <w:t>Out of Band (OOB)</w:t>
+      </w:r>
+      <w:r>
+        <w:t>: The encryption keys are exchanged by some other means than Bluetooth LE, for example by using NFC.</w:t>
+      </w:r>
+    </w:p>
+    <w:p>
+      <w:pPr>
+        <w:pStyle w:val="Heading6"/>
+      </w:pPr>
+      <w:r>
+        <w:rPr>
+          <w:rStyle w:val="Strong"/>
+          <w:color w:val="4B4F58"/>
+          <w:sz w:val="27"/>
+          <w:szCs w:val="27"/>
+        </w:rPr>
+        <w:t>Numeric Comparison (LE Secure Connections only)</w:t>
+      </w:r>
+      <w:r>
+        <w:t>: Both devices display a 6-digit number and the user selects “yes” or “no” to confirm the display.</w:t>
+      </w:r>
+    </w:p>
+    <w:p>
+      <w:pPr>
+        <w:pStyle w:val="Heading4"/>
+      </w:pPr>
+      <w:r>
+        <w:t>Which pairing method to use is decided based on the OOB flag, the Man-In-The-Middle (MITM) flag, and the I/O capabilities of the peers, exchanged during phase 1.</w:t>
+      </w:r>
+    </w:p>
+    <w:p>
+      <w:pPr>
+        <w:pStyle w:val="Heading4"/>
+      </w:pPr>
+      <w:r>
+        <w:t>The OOB and MITM flags first determine whether to use the OOB pairing method directly or determine the pairing method based on the I/O capabilities.</w:t>
+      </w:r>
+    </w:p>
+    <w:p>
+      <w:pPr>
+        <w:jc w:val="center"/>
+      </w:pPr>
+      <w:r>
+        <w:lastRenderedPageBreak/>
+        <w:drawing>
+          <wp:inline distT="0" distB="0" distL="0" distR="0" wp14:anchorId="3BB9EDC1" wp14:editId="01A7352C">
+            <wp:extent cx="4308187" cy="3444949"/>
+            <wp:effectExtent l="0" t="0" r="0" b="3175"/>
+            <wp:docPr id="3" name="Picture 3"/>
+            <wp:cNvGraphicFramePr>
+              <a:graphicFrameLocks xmlns:a="http://schemas.openxmlformats.org/drawingml/2006/main" noChangeAspect="1"/>
+            </wp:cNvGraphicFramePr>
+            <a:graphic xmlns:a="http://schemas.openxmlformats.org/drawingml/2006/main">
+              <a:graphicData uri="http://schemas.openxmlformats.org/drawingml/2006/picture">
+                <pic:pic xmlns:pic="http://schemas.openxmlformats.org/drawingml/2006/picture">
+                  <pic:nvPicPr>
+                    <pic:cNvPr id="1" name=""/>
+                    <pic:cNvPicPr/>
+                  </pic:nvPicPr>
+                  <pic:blipFill>
+                    <a:blip r:embed="rId21"/>
+                    <a:stretch>
+                      <a:fillRect/>
+                    </a:stretch>
+                  </pic:blipFill>
+                  <pic:spPr>
+                    <a:xfrm>
+                      <a:off x="0" y="0"/>
+                      <a:ext cx="4404884" cy="3522271"/>
+                    </a:xfrm>
+                    <a:prstGeom prst="rect">
+                      <a:avLst/>
+                    </a:prstGeom>
+                  </pic:spPr>
+                </pic:pic>
+              </a:graphicData>
+            </a:graphic>
+          </wp:inline>
+        </w:drawing>
+      </w:r>
+    </w:p>
+    <w:p>
+      <w:pPr>
+        <w:pStyle w:val="Heading4"/>
+      </w:pPr>
+      <w:r>
+        <w:t>Notice that in LE Secure Connections, only one of the peers needs to have the OOB flag set, for this pairing method to be used.</w:t>
+      </w:r>
+    </w:p>
+    <w:p>
+      <w:pPr>
+        <w:pStyle w:val="Heading4"/>
+      </w:pPr>
+      <w:r>
+        <w:t>Depending on the OOB and MITM flags, the I/O capabilities of the peers might be used to determine the pairing method. In this case, the following table is used.</w:t>
+      </w:r>
+    </w:p>
+    <w:p>
+      <w:pPr>
+        <w:jc w:val="center"/>
+        <w:rPr>
+          <w:lang w:eastAsia="en-IN"/>
+        </w:rPr>
+      </w:pPr>
+      <w:r>
+        <w:rPr>
+          <w:lang w:eastAsia="en-IN"/>
+        </w:rPr>
+        <w:drawing>
+          <wp:inline distT="0" distB="0" distL="0" distR="0" wp14:anchorId="621C531E" wp14:editId="07B0297F">
+            <wp:extent cx="5270157" cy="4167963"/>
+            <wp:effectExtent l="0" t="0" r="6985" b="4445"/>
+            <wp:docPr id="16" name="Picture 16"/>
+            <wp:cNvGraphicFramePr>
+              <a:graphicFrameLocks xmlns:a="http://schemas.openxmlformats.org/drawingml/2006/main" noChangeAspect="1"/>
+            </wp:cNvGraphicFramePr>
+            <a:graphic xmlns:a="http://schemas.openxmlformats.org/drawingml/2006/main">
+              <a:graphicData uri="http://schemas.openxmlformats.org/drawingml/2006/picture">
+                <pic:pic xmlns:pic="http://schemas.openxmlformats.org/drawingml/2006/picture">
+                  <pic:nvPicPr>
+                    <pic:cNvPr id="1" name=""/>
+                    <pic:cNvPicPr/>
+                  </pic:nvPicPr>
+                  <pic:blipFill>
+                    <a:blip r:embed="rId22"/>
+                    <a:stretch>
+                      <a:fillRect/>
+                    </a:stretch>
+                  </pic:blipFill>
+                  <pic:spPr>
+                    <a:xfrm>
+                      <a:off x="0" y="0"/>
+                      <a:ext cx="5284376" cy="4179208"/>
+                    </a:xfrm>
+                    <a:prstGeom prst="rect">
+                      <a:avLst/>
+                    </a:prstGeom>
+                  </pic:spPr>
+                </pic:pic>
+              </a:graphicData>
+            </a:graphic>
+          </wp:inline>
+        </w:drawing>
+      </w:r>
+    </w:p>
+    <w:p>
+      <w:pPr>
+        <w:pStyle w:val="Heading4"/>
+      </w:pPr>
+      <w:r>
+        <w:lastRenderedPageBreak/>
+        <w:t>The key generated at this phase will be used to encrypt the link after phase 2. If you are only doing pairing, not bonding, then only these 2 phases will be performed and the peers will skip phase 3.</w:t>
+      </w:r>
+    </w:p>
+    <w:p>
+      <w:pPr>
+        <w:pStyle w:val="Heading5"/>
+      </w:pPr>
+      <w:r>
+        <w:t>Phase 3: Key distribution</w:t>
+      </w:r>
+    </w:p>
+    <w:p>
+      <w:pPr>
+        <w:pStyle w:val="Heading4"/>
+      </w:pPr>
+      <w:r>
+        <w:t>In this phase, the Long Term Key (LTK) is used to distribute the rest of the keys. In legacy pairing, the LTK is also generated in this phase (in LE Secure Connections, the LTK is generated in phase 2). Other keys are also generated and exchanged in this phase, to identify the peers the next time they re-connect and to be able to re-encrypt the link using the same LTK.</w:t>
+      </w:r>
+    </w:p>
+    <w:p>
+      <w:pPr>
+        <w:rPr>
+          <w:lang w:eastAsia="en-IN"/>
+        </w:rPr>
+      </w:pPr>
+      <w:r>
+        <w:rPr>
+          <w:lang w:eastAsia="en-IN"/>
+        </w:rPr>
+        <w:drawing>
+          <wp:inline distT="0" distB="0" distL="0" distR="0" wp14:anchorId="55BCB7B8" wp14:editId="2079BD3E">
+            <wp:extent cx="5725324" cy="3686689"/>
+            <wp:effectExtent l="0" t="0" r="8890" b="9525"/>
+            <wp:docPr id="17" name="Picture 17"/>
+            <wp:cNvGraphicFramePr>
+              <a:graphicFrameLocks xmlns:a="http://schemas.openxmlformats.org/drawingml/2006/main" noChangeAspect="1"/>
+            </wp:cNvGraphicFramePr>
+            <a:graphic xmlns:a="http://schemas.openxmlformats.org/drawingml/2006/main">
+              <a:graphicData uri="http://schemas.openxmlformats.org/drawingml/2006/picture">
+                <pic:pic xmlns:pic="http://schemas.openxmlformats.org/drawingml/2006/picture">
+                  <pic:nvPicPr>
+                    <pic:cNvPr id="1" name=""/>
+                    <pic:cNvPicPr/>
+                  </pic:nvPicPr>
+                  <pic:blipFill>
+                    <a:blip r:embed="rId23"/>
+                    <a:stretch>
+                      <a:fillRect/>
+                    </a:stretch>
+                  </pic:blipFill>
+                  <pic:spPr>
+                    <a:xfrm>
+                      <a:off x="0" y="0"/>
+                      <a:ext cx="5725324" cy="3686689"/>
+                    </a:xfrm>
+                    <a:prstGeom prst="rect">
+                      <a:avLst/>
+                    </a:prstGeom>
+                  </pic:spPr>
+                </pic:pic>
+              </a:graphicData>
+            </a:graphic>
+          </wp:inline>
+        </w:drawing>
+      </w:r>
+    </w:p>
+    <w:p>
+      <w:pPr>
+        <w:pStyle w:val="Heading3"/>
+      </w:pPr>
+      <w:r>
+        <w:t>Security levels</w:t>
+      </w:r>
+    </w:p>
+    <w:p>
+      <w:pPr>
+        <w:pStyle w:val="Heading4"/>
+      </w:pPr>
+      <w:r>
+        <w:t>Bluetooth LE defines 4 security levels in security mode 1:</w:t>
+      </w:r>
+    </w:p>
+    <w:p>
+      <w:pPr>
+        <w:pStyle w:val="Heading6"/>
+      </w:pPr>
+      <w:r>
+        <w:rPr>
+          <w:rStyle w:val="Strong"/>
+          <w:b w:val="0"/>
+          <w:bCs w:val="0"/>
+        </w:rPr>
+        <w:t>Level 1:</w:t>
+      </w:r>
+      <w:r>
+        <w:t> No security (open text, meaning no authentication and no encryption) </w:t>
+      </w:r>
+    </w:p>
+    <w:p>
+      <w:pPr>
+        <w:pStyle w:val="Heading6"/>
+      </w:pPr>
+      <w:r>
+        <w:rPr>
+          <w:rStyle w:val="Strong"/>
+          <w:b w:val="0"/>
+          <w:bCs w:val="0"/>
+        </w:rPr>
+        <w:t>Level 2</w:t>
+      </w:r>
+      <w:r>
+        <w:t>: Encryption with unauthenticated pairing</w:t>
+      </w:r>
+    </w:p>
+    <w:p>
+      <w:pPr>
+        <w:pStyle w:val="Heading6"/>
+      </w:pPr>
+      <w:r>
+        <w:rPr>
+          <w:rStyle w:val="Strong"/>
+          <w:b w:val="0"/>
+          <w:bCs w:val="0"/>
+        </w:rPr>
+        <w:t>Level 3</w:t>
+      </w:r>
+      <w:r>
+        <w:t>: Authenticated pairing with encryption</w:t>
+      </w:r>
+    </w:p>
+    <w:p>
+      <w:pPr>
+        <w:pStyle w:val="Heading6"/>
+      </w:pPr>
+      <w:r>
+        <w:rPr>
+          <w:rStyle w:val="Strong"/>
+          <w:b w:val="0"/>
+          <w:bCs w:val="0"/>
+        </w:rPr>
+        <w:t>Level 4</w:t>
+      </w:r>
+      <w:r>
+        <w:t>: Authenticated LE Secure Connections pairing with encryption</w:t>
+      </w:r>
+    </w:p>
+    <w:p>
+      <w:pPr>
+        <w:pStyle w:val="Heading4"/>
+      </w:pPr>
+      <w:r>
+        <w:t>Each connection starts at security level 1, and then upgraded to a higher security level depending on which pairing method is used.</w:t>
+      </w:r>
+    </w:p>
+    <w:p>
+      <w:pPr>
+        <w:pStyle w:val="Heading4"/>
+      </w:pPr>
+      <w:r>
+        <w:t xml:space="preserve">Using Legacy </w:t>
+      </w:r>
+      <w:proofErr w:type="gramStart"/>
+      <w:r>
+        <w:t>Pairing</w:t>
+      </w:r>
+      <w:proofErr w:type="gramEnd"/>
+      <w:r>
+        <w:t xml:space="preserve"> with either Just Works, or Passkey Entry or LE Secure Connections with Just Work bring the connection to security level 2. These methods does not protect against MITM attacks, since the link is just encrypted, and not </w:t>
+      </w:r>
+      <w:r>
+        <w:lastRenderedPageBreak/>
+        <w:t>authenticated. To protect against MITM, the connection needs to be at authenticated security level 3 or higher. This can be achieved by using OOB pairing method with Legacy pairing which is at level 3 Authenticated pairing with encryption. The connection only gets security level 4 if both peers support LE Secure Connections and either Passkey Entry, Numeric Comparison, or OOB authentication method is used.</w:t>
+      </w:r>
+    </w:p>
+    <w:p>
+      <w:pPr>
+        <w:pStyle w:val="Heading4"/>
+      </w:pPr>
+      <w:r>
+        <w:t>The </w:t>
+      </w:r>
+      <w:r>
+        <w:rPr>
+          <w:rStyle w:val="Strong"/>
+          <w:b w:val="0"/>
+          <w:bCs w:val="0"/>
+        </w:rPr>
+        <w:t>Permissions</w:t>
+      </w:r>
+      <w:r>
+        <w:t> field of a characteristic determines not only whether the attribute is readable and/or writeable, but also the security level required of that connection for the attribute to be accessible. For instance, if a link is encrypted with security level 2, unauthenticated encryption, the peer will not be able to access any characteristic that requires authenticated security of level 3 or 4.</w:t>
+      </w:r>
+    </w:p>
+    <w:p>
+      <w:pPr>
+        <w:pStyle w:val="Heading4"/>
+      </w:pPr>
+      <w:r>
+        <w:t>Bluetooth LE has a total of </w:t>
+      </w:r>
+      <w:hyperlink r:id="rId24" w:anchor="UUID-a8b8b051-dfe4-037b-ec0b-3efdfd6d9d3c" w:history="1">
+        <w:r>
+          <w:rPr>
+            <w:rStyle w:val="Hyperlink"/>
+            <w:color w:val="0D0D0D" w:themeColor="text1" w:themeTint="F2"/>
+            <w:u w:val="none"/>
+          </w:rPr>
+          <w:t>3 security modes</w:t>
+        </w:r>
+      </w:hyperlink>
+      <w:r>
+        <w:t>. Security mode 2 uses data signing for security and is rarely used. Security mode 3 pertains to isochronous broadcast which is used with Bluetooth LE Audio and is fairly new. This course only focuses on security mode 1.</w:t>
+      </w:r>
+    </w:p>
+    <w:p>
+      <w:pPr>
+        <w:rPr>
+          <w:lang w:eastAsia="en-IN"/>
+        </w:rPr>
+      </w:pPr>
+    </w:p>
+    <w:p>
+      <w:pPr>
+        <w:pStyle w:val="Heading3"/>
+      </w:pPr>
+      <w:r>
+        <w:t>Filter Accept List</w:t>
+      </w:r>
+    </w:p>
+    <w:p>
+      <w:pPr>
+        <w:pStyle w:val="Heading4"/>
+      </w:pPr>
+      <w:r>
+        <w:t>Filter Accept List, for</w:t>
+      </w:r>
       <w:bookmarkStart w:id="0" w:name="_GoBack"/>
       <w:bookmarkEnd w:id="0"/>
-    </w:p>
+      <w:r>
+        <w:t>merly known as Whitelisting, is a way of limiting access to a list of devices in both advertising and scanning.</w:t>
+      </w:r>
+    </w:p>
+    <w:p>
+      <w:pPr>
+        <w:pStyle w:val="Heading4"/>
+      </w:pPr>
+      <w:r>
+        <w:t>When used in advertising, only the devices in the Filter Accept List can send a connection request to establish a connection or send a scan request to get the scan response from the advertiser. If a device not on the list sends these requests, the advertiser will ignore the request.</w:t>
+      </w:r>
+    </w:p>
+    <w:p>
+      <w:pPr>
+        <w:pStyle w:val="Heading4"/>
+      </w:pPr>
+      <w:r>
+        <w:t>When used in scanning, only the advertising and scan response packet from the devices in the list will be scanned and reported to the application. The scanner will filter out any packet from other advertisers.</w:t>
+      </w:r>
+    </w:p>
+    <w:p>
+      <w:pPr>
+        <w:rPr>
+          <w:lang w:eastAsia="en-IN"/>
+        </w:rPr>
+      </w:pPr>
+    </w:p>
+    <w:p>
+      <w:pPr>
+        <w:rPr>
+          <w:lang w:eastAsia="en-IN"/>
+        </w:rPr>
+      </w:pPr>
+    </w:p>
+    <w:p/>
+    <w:p/>
     <w:sectPr>
       <w:pgSz w:w="11906" w:h="16838"/>
       <w:pgMar w:top="1440" w:right="1440" w:bottom="1440" w:left="1440" w:header="708" w:footer="708" w:gutter="0"/>
@@ -3887,6 +4220,155 @@
     </w:lvl>
   </w:abstractNum>
   <w:abstractNum w:abstractNumId="3">
+    <w:nsid w:val="15E76E4F"/>
+    <w:multiLevelType w:val="multilevel"/>
+    <w:tmpl w:val="2946A8B2"/>
+    <w:lvl w:ilvl="0">
+      <w:start w:val="1"/>
+      <w:numFmt w:val="bullet"/>
+      <w:lvlText w:val=""/>
+      <w:lvlJc w:val="left"/>
+      <w:pPr>
+        <w:tabs>
+          <w:tab w:val="num" w:pos="720"/>
+        </w:tabs>
+        <w:ind w:left="720" w:hanging="360"/>
+      </w:pPr>
+      <w:rPr>
+        <w:rFonts w:ascii="Symbol" w:hAnsi="Symbol" w:hint="default"/>
+        <w:sz w:val="20"/>
+      </w:rPr>
+    </w:lvl>
+    <w:lvl w:ilvl="1" w:tentative="1">
+      <w:start w:val="1"/>
+      <w:numFmt w:val="bullet"/>
+      <w:lvlText w:val=""/>
+      <w:lvlJc w:val="left"/>
+      <w:pPr>
+        <w:tabs>
+          <w:tab w:val="num" w:pos="1440"/>
+        </w:tabs>
+        <w:ind w:left="1440" w:hanging="360"/>
+      </w:pPr>
+      <w:rPr>
+        <w:rFonts w:ascii="Symbol" w:hAnsi="Symbol" w:hint="default"/>
+        <w:sz w:val="20"/>
+      </w:rPr>
+    </w:lvl>
+    <w:lvl w:ilvl="2" w:tentative="1">
+      <w:start w:val="1"/>
+      <w:numFmt w:val="bullet"/>
+      <w:lvlText w:val=""/>
+      <w:lvlJc w:val="left"/>
+      <w:pPr>
+        <w:tabs>
+          <w:tab w:val="num" w:pos="2160"/>
+        </w:tabs>
+        <w:ind w:left="2160" w:hanging="360"/>
+      </w:pPr>
+      <w:rPr>
+        <w:rFonts w:ascii="Symbol" w:hAnsi="Symbol" w:hint="default"/>
+        <w:sz w:val="20"/>
+      </w:rPr>
+    </w:lvl>
+    <w:lvl w:ilvl="3" w:tentative="1">
+      <w:start w:val="1"/>
+      <w:numFmt w:val="bullet"/>
+      <w:lvlText w:val=""/>
+      <w:lvlJc w:val="left"/>
+      <w:pPr>
+        <w:tabs>
+          <w:tab w:val="num" w:pos="2880"/>
+        </w:tabs>
+        <w:ind w:left="2880" w:hanging="360"/>
+      </w:pPr>
+      <w:rPr>
+        <w:rFonts w:ascii="Symbol" w:hAnsi="Symbol" w:hint="default"/>
+        <w:sz w:val="20"/>
+      </w:rPr>
+    </w:lvl>
+    <w:lvl w:ilvl="4" w:tentative="1">
+      <w:start w:val="1"/>
+      <w:numFmt w:val="bullet"/>
+      <w:lvlText w:val=""/>
+      <w:lvlJc w:val="left"/>
+      <w:pPr>
+        <w:tabs>
+          <w:tab w:val="num" w:pos="3600"/>
+        </w:tabs>
+        <w:ind w:left="3600" w:hanging="360"/>
+      </w:pPr>
+      <w:rPr>
+        <w:rFonts w:ascii="Symbol" w:hAnsi="Symbol" w:hint="default"/>
+        <w:sz w:val="20"/>
+      </w:rPr>
+    </w:lvl>
+    <w:lvl w:ilvl="5" w:tentative="1">
+      <w:start w:val="1"/>
+      <w:numFmt w:val="bullet"/>
+      <w:lvlText w:val=""/>
+      <w:lvlJc w:val="left"/>
+      <w:pPr>
+        <w:tabs>
+          <w:tab w:val="num" w:pos="4320"/>
+        </w:tabs>
+        <w:ind w:left="4320" w:hanging="360"/>
+      </w:pPr>
+      <w:rPr>
+        <w:rFonts w:ascii="Symbol" w:hAnsi="Symbol" w:hint="default"/>
+        <w:sz w:val="20"/>
+      </w:rPr>
+    </w:lvl>
+    <w:lvl w:ilvl="6" w:tentative="1">
+      <w:start w:val="1"/>
+      <w:numFmt w:val="bullet"/>
+      <w:lvlText w:val=""/>
+      <w:lvlJc w:val="left"/>
+      <w:pPr>
+        <w:tabs>
+          <w:tab w:val="num" w:pos="5040"/>
+        </w:tabs>
+        <w:ind w:left="5040" w:hanging="360"/>
+      </w:pPr>
+      <w:rPr>
+        <w:rFonts w:ascii="Symbol" w:hAnsi="Symbol" w:hint="default"/>
+        <w:sz w:val="20"/>
+      </w:rPr>
+    </w:lvl>
+    <w:lvl w:ilvl="7" w:tentative="1">
+      <w:start w:val="1"/>
+      <w:numFmt w:val="bullet"/>
+      <w:lvlText w:val=""/>
+      <w:lvlJc w:val="left"/>
+      <w:pPr>
+        <w:tabs>
+          <w:tab w:val="num" w:pos="5760"/>
+        </w:tabs>
+        <w:ind w:left="5760" w:hanging="360"/>
+      </w:pPr>
+      <w:rPr>
+        <w:rFonts w:ascii="Symbol" w:hAnsi="Symbol" w:hint="default"/>
+        <w:sz w:val="20"/>
+      </w:rPr>
+    </w:lvl>
+    <w:lvl w:ilvl="8" w:tentative="1">
+      <w:start w:val="1"/>
+      <w:numFmt w:val="bullet"/>
+      <w:lvlText w:val=""/>
+      <w:lvlJc w:val="left"/>
+      <w:pPr>
+        <w:tabs>
+          <w:tab w:val="num" w:pos="6480"/>
+        </w:tabs>
+        <w:ind w:left="6480" w:hanging="360"/>
+      </w:pPr>
+      <w:rPr>
+        <w:rFonts w:ascii="Symbol" w:hAnsi="Symbol" w:hint="default"/>
+        <w:sz w:val="20"/>
+      </w:rPr>
+    </w:lvl>
+  </w:abstractNum>
+  <w:abstractNum w:abstractNumId="4">
     <w:nsid w:val="23BE6FA7"/>
     <w:multiLevelType w:val="hybridMultilevel"/>
     <w:tmpl w:val="44027E4E"/>
@@ -4000,7 +4482,7 @@
       </w:rPr>
     </w:lvl>
   </w:abstractNum>
-  <w:abstractNum w:abstractNumId="4">
+  <w:abstractNum w:abstractNumId="5">
     <w:nsid w:val="2BDA0054"/>
     <w:multiLevelType w:val="multilevel"/>
     <w:tmpl w:val="D61684E0"/>
@@ -4150,7 +4632,7 @@
       </w:rPr>
     </w:lvl>
   </w:abstractNum>
-  <w:abstractNum w:abstractNumId="5">
+  <w:abstractNum w:abstractNumId="6">
     <w:nsid w:val="56B77094"/>
     <w:multiLevelType w:val="hybridMultilevel"/>
     <w:tmpl w:val="9C40C526"/>
@@ -4262,7 +4744,305 @@
       </w:rPr>
     </w:lvl>
   </w:abstractNum>
-  <w:abstractNum w:abstractNumId="6">
+  <w:abstractNum w:abstractNumId="7">
+    <w:nsid w:val="590725A9"/>
+    <w:multiLevelType w:val="multilevel"/>
+    <w:tmpl w:val="0082F44A"/>
+    <w:lvl w:ilvl="0">
+      <w:start w:val="1"/>
+      <w:numFmt w:val="bullet"/>
+      <w:lvlText w:val=""/>
+      <w:lvlJc w:val="left"/>
+      <w:pPr>
+        <w:tabs>
+          <w:tab w:val="num" w:pos="720"/>
+        </w:tabs>
+        <w:ind w:left="720" w:hanging="360"/>
+      </w:pPr>
+      <w:rPr>
+        <w:rFonts w:ascii="Symbol" w:hAnsi="Symbol" w:hint="default"/>
+        <w:sz w:val="20"/>
+      </w:rPr>
+    </w:lvl>
+    <w:lvl w:ilvl="1" w:tentative="1">
+      <w:start w:val="1"/>
+      <w:numFmt w:val="bullet"/>
+      <w:lvlText w:val=""/>
+      <w:lvlJc w:val="left"/>
+      <w:pPr>
+        <w:tabs>
+          <w:tab w:val="num" w:pos="1440"/>
+        </w:tabs>
+        <w:ind w:left="1440" w:hanging="360"/>
+      </w:pPr>
+      <w:rPr>
+        <w:rFonts w:ascii="Symbol" w:hAnsi="Symbol" w:hint="default"/>
+        <w:sz w:val="20"/>
+      </w:rPr>
+    </w:lvl>
+    <w:lvl w:ilvl="2" w:tentative="1">
+      <w:start w:val="1"/>
+      <w:numFmt w:val="bullet"/>
+      <w:lvlText w:val=""/>
+      <w:lvlJc w:val="left"/>
+      <w:pPr>
+        <w:tabs>
+          <w:tab w:val="num" w:pos="2160"/>
+        </w:tabs>
+        <w:ind w:left="2160" w:hanging="360"/>
+      </w:pPr>
+      <w:rPr>
+        <w:rFonts w:ascii="Symbol" w:hAnsi="Symbol" w:hint="default"/>
+        <w:sz w:val="20"/>
+      </w:rPr>
+    </w:lvl>
+    <w:lvl w:ilvl="3" w:tentative="1">
+      <w:start w:val="1"/>
+      <w:numFmt w:val="bullet"/>
+      <w:lvlText w:val=""/>
+      <w:lvlJc w:val="left"/>
+      <w:pPr>
+        <w:tabs>
+          <w:tab w:val="num" w:pos="2880"/>
+        </w:tabs>
+        <w:ind w:left="2880" w:hanging="360"/>
+      </w:pPr>
+      <w:rPr>
+        <w:rFonts w:ascii="Symbol" w:hAnsi="Symbol" w:hint="default"/>
+        <w:sz w:val="20"/>
+      </w:rPr>
+    </w:lvl>
+    <w:lvl w:ilvl="4" w:tentative="1">
+      <w:start w:val="1"/>
+      <w:numFmt w:val="bullet"/>
+      <w:lvlText w:val=""/>
+      <w:lvlJc w:val="left"/>
+      <w:pPr>
+        <w:tabs>
+          <w:tab w:val="num" w:pos="3600"/>
+        </w:tabs>
+        <w:ind w:left="3600" w:hanging="360"/>
+      </w:pPr>
+      <w:rPr>
+        <w:rFonts w:ascii="Symbol" w:hAnsi="Symbol" w:hint="default"/>
+        <w:sz w:val="20"/>
+      </w:rPr>
+    </w:lvl>
+    <w:lvl w:ilvl="5" w:tentative="1">
+      <w:start w:val="1"/>
+      <w:numFmt w:val="bullet"/>
+      <w:lvlText w:val=""/>
+      <w:lvlJc w:val="left"/>
+      <w:pPr>
+        <w:tabs>
+          <w:tab w:val="num" w:pos="4320"/>
+        </w:tabs>
+        <w:ind w:left="4320" w:hanging="360"/>
+      </w:pPr>
+      <w:rPr>
+        <w:rFonts w:ascii="Symbol" w:hAnsi="Symbol" w:hint="default"/>
+        <w:sz w:val="20"/>
+      </w:rPr>
+    </w:lvl>
+    <w:lvl w:ilvl="6" w:tentative="1">
+      <w:start w:val="1"/>
+      <w:numFmt w:val="bullet"/>
+      <w:lvlText w:val=""/>
+      <w:lvlJc w:val="left"/>
+      <w:pPr>
+        <w:tabs>
+          <w:tab w:val="num" w:pos="5040"/>
+        </w:tabs>
+        <w:ind w:left="5040" w:hanging="360"/>
+      </w:pPr>
+      <w:rPr>
+        <w:rFonts w:ascii="Symbol" w:hAnsi="Symbol" w:hint="default"/>
+        <w:sz w:val="20"/>
+      </w:rPr>
+    </w:lvl>
+    <w:lvl w:ilvl="7" w:tentative="1">
+      <w:start w:val="1"/>
+      <w:numFmt w:val="bullet"/>
+      <w:lvlText w:val=""/>
+      <w:lvlJc w:val="left"/>
+      <w:pPr>
+        <w:tabs>
+          <w:tab w:val="num" w:pos="5760"/>
+        </w:tabs>
+        <w:ind w:left="5760" w:hanging="360"/>
+      </w:pPr>
+      <w:rPr>
+        <w:rFonts w:ascii="Symbol" w:hAnsi="Symbol" w:hint="default"/>
+        <w:sz w:val="20"/>
+      </w:rPr>
+    </w:lvl>
+    <w:lvl w:ilvl="8" w:tentative="1">
+      <w:start w:val="1"/>
+      <w:numFmt w:val="bullet"/>
+      <w:lvlText w:val=""/>
+      <w:lvlJc w:val="left"/>
+      <w:pPr>
+        <w:tabs>
+          <w:tab w:val="num" w:pos="6480"/>
+        </w:tabs>
+        <w:ind w:left="6480" w:hanging="360"/>
+      </w:pPr>
+      <w:rPr>
+        <w:rFonts w:ascii="Symbol" w:hAnsi="Symbol" w:hint="default"/>
+        <w:sz w:val="20"/>
+      </w:rPr>
+    </w:lvl>
+  </w:abstractNum>
+  <w:abstractNum w:abstractNumId="8">
+    <w:nsid w:val="695F3FB1"/>
+    <w:multiLevelType w:val="multilevel"/>
+    <w:tmpl w:val="4FDC004C"/>
+    <w:lvl w:ilvl="0">
+      <w:start w:val="1"/>
+      <w:numFmt w:val="bullet"/>
+      <w:lvlText w:val=""/>
+      <w:lvlJc w:val="left"/>
+      <w:pPr>
+        <w:tabs>
+          <w:tab w:val="num" w:pos="720"/>
+        </w:tabs>
+        <w:ind w:left="720" w:hanging="360"/>
+      </w:pPr>
+      <w:rPr>
+        <w:rFonts w:ascii="Symbol" w:hAnsi="Symbol" w:hint="default"/>
+        <w:sz w:val="20"/>
+      </w:rPr>
+    </w:lvl>
+    <w:lvl w:ilvl="1" w:tentative="1">
+      <w:start w:val="1"/>
+      <w:numFmt w:val="bullet"/>
+      <w:lvlText w:val=""/>
+      <w:lvlJc w:val="left"/>
+      <w:pPr>
+        <w:tabs>
+          <w:tab w:val="num" w:pos="1440"/>
+        </w:tabs>
+        <w:ind w:left="1440" w:hanging="360"/>
+      </w:pPr>
+      <w:rPr>
+        <w:rFonts w:ascii="Symbol" w:hAnsi="Symbol" w:hint="default"/>
+        <w:sz w:val="20"/>
+      </w:rPr>
+    </w:lvl>
+    <w:lvl w:ilvl="2" w:tentative="1">
+      <w:start w:val="1"/>
+      <w:numFmt w:val="bullet"/>
+      <w:lvlText w:val=""/>
+      <w:lvlJc w:val="left"/>
+      <w:pPr>
+        <w:tabs>
+          <w:tab w:val="num" w:pos="2160"/>
+        </w:tabs>
+        <w:ind w:left="2160" w:hanging="360"/>
+      </w:pPr>
+      <w:rPr>
+        <w:rFonts w:ascii="Symbol" w:hAnsi="Symbol" w:hint="default"/>
+        <w:sz w:val="20"/>
+      </w:rPr>
+    </w:lvl>
+    <w:lvl w:ilvl="3" w:tentative="1">
+      <w:start w:val="1"/>
+      <w:numFmt w:val="bullet"/>
+      <w:lvlText w:val=""/>
+      <w:lvlJc w:val="left"/>
+      <w:pPr>
+        <w:tabs>
+          <w:tab w:val="num" w:pos="2880"/>
+        </w:tabs>
+        <w:ind w:left="2880" w:hanging="360"/>
+      </w:pPr>
+      <w:rPr>
+        <w:rFonts w:ascii="Symbol" w:hAnsi="Symbol" w:hint="default"/>
+        <w:sz w:val="20"/>
+      </w:rPr>
+    </w:lvl>
+    <w:lvl w:ilvl="4" w:tentative="1">
+      <w:start w:val="1"/>
+      <w:numFmt w:val="bullet"/>
+      <w:lvlText w:val=""/>
+      <w:lvlJc w:val="left"/>
+      <w:pPr>
+        <w:tabs>
+          <w:tab w:val="num" w:pos="3600"/>
+        </w:tabs>
+        <w:ind w:left="3600" w:hanging="360"/>
+      </w:pPr>
+      <w:rPr>
+        <w:rFonts w:ascii="Symbol" w:hAnsi="Symbol" w:hint="default"/>
+        <w:sz w:val="20"/>
+      </w:rPr>
+    </w:lvl>
+    <w:lvl w:ilvl="5" w:tentative="1">
+      <w:start w:val="1"/>
+      <w:numFmt w:val="bullet"/>
+      <w:lvlText w:val=""/>
+      <w:lvlJc w:val="left"/>
+      <w:pPr>
+        <w:tabs>
+          <w:tab w:val="num" w:pos="4320"/>
+        </w:tabs>
+        <w:ind w:left="4320" w:hanging="360"/>
+      </w:pPr>
+      <w:rPr>
+        <w:rFonts w:ascii="Symbol" w:hAnsi="Symbol" w:hint="default"/>
+        <w:sz w:val="20"/>
+      </w:rPr>
+    </w:lvl>
+    <w:lvl w:ilvl="6" w:tentative="1">
+      <w:start w:val="1"/>
+      <w:numFmt w:val="bullet"/>
+      <w:lvlText w:val=""/>
+      <w:lvlJc w:val="left"/>
+      <w:pPr>
+        <w:tabs>
+          <w:tab w:val="num" w:pos="5040"/>
+        </w:tabs>
+        <w:ind w:left="5040" w:hanging="360"/>
+      </w:pPr>
+      <w:rPr>
+        <w:rFonts w:ascii="Symbol" w:hAnsi="Symbol" w:hint="default"/>
+        <w:sz w:val="20"/>
+      </w:rPr>
+    </w:lvl>
+    <w:lvl w:ilvl="7" w:tentative="1">
+      <w:start w:val="1"/>
+      <w:numFmt w:val="bullet"/>
+      <w:lvlText w:val=""/>
+      <w:lvlJc w:val="left"/>
+      <w:pPr>
+        <w:tabs>
+          <w:tab w:val="num" w:pos="5760"/>
+        </w:tabs>
+        <w:ind w:left="5760" w:hanging="360"/>
+      </w:pPr>
+      <w:rPr>
+        <w:rFonts w:ascii="Symbol" w:hAnsi="Symbol" w:hint="default"/>
+        <w:sz w:val="20"/>
+      </w:rPr>
+    </w:lvl>
+    <w:lvl w:ilvl="8" w:tentative="1">
+      <w:start w:val="1"/>
+      <w:numFmt w:val="bullet"/>
+      <w:lvlText w:val=""/>
+      <w:lvlJc w:val="left"/>
+      <w:pPr>
+        <w:tabs>
+          <w:tab w:val="num" w:pos="6480"/>
+        </w:tabs>
+        <w:ind w:left="6480" w:hanging="360"/>
+      </w:pPr>
+      <w:rPr>
+        <w:rFonts w:ascii="Symbol" w:hAnsi="Symbol" w:hint="default"/>
+        <w:sz w:val="20"/>
+      </w:rPr>
+    </w:lvl>
+  </w:abstractNum>
+  <w:abstractNum w:abstractNumId="9">
     <w:nsid w:val="721026C9"/>
     <w:multiLevelType w:val="hybridMultilevel"/>
     <w:tmpl w:val="D248A50A"/>
@@ -4376,7 +5156,7 @@
       </w:rPr>
     </w:lvl>
   </w:abstractNum>
-  <w:abstractNum w:abstractNumId="7">
+  <w:abstractNum w:abstractNumId="10">
     <w:nsid w:val="7BC202EF"/>
     <w:multiLevelType w:val="hybridMultilevel"/>
     <w:tmpl w:val="FD66D270"/>
@@ -4491,16 +5271,16 @@
     </w:lvl>
   </w:abstractNum>
   <w:num w:numId="1">
-    <w:abstractNumId w:val="5"/>
+    <w:abstractNumId w:val="6"/>
   </w:num>
   <w:num w:numId="2">
-    <w:abstractNumId w:val="7"/>
+    <w:abstractNumId w:val="10"/>
   </w:num>
   <w:num w:numId="3">
-    <w:abstractNumId w:val="6"/>
+    <w:abstractNumId w:val="9"/>
   </w:num>
   <w:num w:numId="4">
-    <w:abstractNumId w:val="4"/>
+    <w:abstractNumId w:val="5"/>
   </w:num>
   <w:num w:numId="5">
     <w:abstractNumId w:val="2"/>
@@ -4512,6 +5292,15 @@
     <w:abstractNumId w:val="1"/>
   </w:num>
   <w:num w:numId="8">
+    <w:abstractNumId w:val="4"/>
+  </w:num>
+  <w:num w:numId="9">
+    <w:abstractNumId w:val="7"/>
+  </w:num>
+  <w:num w:numId="10">
+    <w:abstractNumId w:val="8"/>
+  </w:num>
+  <w:num w:numId="11">
     <w:abstractNumId w:val="3"/>
   </w:num>
 </w:numbering>

</xml_diff>